<commit_message>
Lampiran 2 SP-001: foto kunjungan Pertamina ke Lab IoT ITB 6 Agustus 2026
Co-Authored-By: Claude Opus 5.5 <noreply@anthropic.com>
Claude-Session: https://claude.ai/code/session_01RNmbaVJ5kQVKwCKRCRa4ED
</commit_message>
<xml_diff>
--- a/Paket LGU/03_Pemenuhan_Klausul_Termin_SP-001_Sertifikasi/Dokumen_Pemenuhan_Klausul_Termin_SP-001_Sertifikasi_GLD.docx
+++ b/Paket LGU/03_Pemenuhan_Klausul_Termin_SP-001_Sertifikasi/Dokumen_Pemenuhan_Klausul_Termin_SP-001_Sertifikasi_GLD.docx
@@ -2818,52 +2818,41 @@
             <w:pPr>
               <w:jc w:val="center"/>
             </w:pPr>
+            <w:r>
+              <w:drawing>
+                <wp:inline xmlns:a="http://schemas.openxmlformats.org/drawingml/2006/main" xmlns:pic="http://schemas.openxmlformats.org/drawingml/2006/picture">
+                  <wp:extent cx="2112000" cy="1584000"/>
+                  <wp:docPr id="12" name="Picture 12"/>
+                  <wp:cNvGraphicFramePr>
+                    <a:graphicFrameLocks noChangeAspect="1"/>
+                  </wp:cNvGraphicFramePr>
+                  <a:graphic>
+                    <a:graphicData uri="http://schemas.openxmlformats.org/drawingml/2006/picture">
+                      <pic:pic>
+                        <pic:nvPicPr>
+                          <pic:cNvPr id="0" name="image.jpg"/>
+                          <pic:cNvPicPr/>
+                        </pic:nvPicPr>
+                        <pic:blipFill>
+                          <a:blip r:embed="rId21"/>
+                          <a:stretch>
+                            <a:fillRect/>
+                          </a:stretch>
+                        </pic:blipFill>
+                        <pic:spPr>
+                          <a:xfrm>
+                            <a:off x="0" y="0"/>
+                            <a:ext cx="2112000" cy="1584000"/>
+                          </a:xfrm>
+                          <a:prstGeom prst="rect"/>
+                        </pic:spPr>
+                      </pic:pic>
+                    </a:graphicData>
+                  </a:graphic>
+                </wp:inline>
+              </w:drawing>
+            </w:r>
           </w:p>
-          <w:tbl>
-            <w:tblPr>
-              <w:tblW w:type="auto" w:w="0"/>
-              <w:tblLook w:firstColumn="1" w:firstRow="1" w:lastColumn="0" w:lastRow="0" w:noHBand="0" w:noVBand="1" w:val="04A0"/>
-              <w:tblBorders>
-                <w:top w:val="single" w:sz="8" w:color="000000"/>
-                <w:left w:val="single" w:sz="8" w:color="000000"/>
-                <w:bottom w:val="single" w:sz="8" w:color="000000"/>
-                <w:right w:val="single" w:sz="8" w:color="000000"/>
-                <w:insideH w:val="single" w:sz="8" w:color="000000"/>
-                <w:insideV w:val="single" w:sz="8" w:color="000000"/>
-              </w:tblBorders>
-            </w:tblPr>
-            <w:tblGrid>
-              <w:gridCol w:w="4649"/>
-            </w:tblGrid>
-            <w:tr>
-              <w:trPr>
-                <w:trHeight w:val="2494"/>
-              </w:trPr>
-              <w:tc>
-                <w:tcPr>
-                  <w:tcW w:type="dxa" w:w="3969"/>
-                  <w:vAlign w:val="center"/>
-                </w:tcPr>
-                <w:p>
-                  <w:pPr>
-                    <w:spacing w:after="0"/>
-                    <w:jc w:val="center"/>
-                  </w:pPr>
-                  <w:r>
-                    <w:rPr>
-                      <w:rFonts w:ascii="Arial" w:hAnsi="Arial" w:eastAsia="Arial"/>
-                      <w:b w:val="0"/>
-                      <w:i w:val="0"/>
-                      <w:sz w:val="18"/>
-                      <w:u w:val="none"/>
-                    </w:rPr>
-                    <w:t>[ tempel foto kunjungan ]</w:t>
-                  </w:r>
-                </w:p>
-              </w:tc>
-            </w:tr>
-          </w:tbl>
-          <w:p/>
           <w:p>
             <w:pPr>
               <w:spacing w:after="160"/>
@@ -2877,7 +2866,7 @@
                 <w:sz w:val="17"/>
                 <w:u w:val="none"/>
               </w:rPr>
-              <w:t>Foto 9 — Kunjungan Pertamina ke Lab IoT ITB, 6 Agustus 2026</w:t>
+              <w:t>Foto 9 — Rapat pembahasan progres GLD</w:t>
             </w:r>
           </w:p>
         </w:tc>
@@ -2889,52 +2878,41 @@
             <w:pPr>
               <w:jc w:val="center"/>
             </w:pPr>
+            <w:r>
+              <w:drawing>
+                <wp:inline xmlns:a="http://schemas.openxmlformats.org/drawingml/2006/main" xmlns:pic="http://schemas.openxmlformats.org/drawingml/2006/picture">
+                  <wp:extent cx="2112000" cy="1584000"/>
+                  <wp:docPr id="13" name="Picture 13"/>
+                  <wp:cNvGraphicFramePr>
+                    <a:graphicFrameLocks noChangeAspect="1"/>
+                  </wp:cNvGraphicFramePr>
+                  <a:graphic>
+                    <a:graphicData uri="http://schemas.openxmlformats.org/drawingml/2006/picture">
+                      <pic:pic>
+                        <pic:nvPicPr>
+                          <pic:cNvPr id="0" name="image.jpg"/>
+                          <pic:cNvPicPr/>
+                        </pic:nvPicPr>
+                        <pic:blipFill>
+                          <a:blip r:embed="rId22"/>
+                          <a:stretch>
+                            <a:fillRect/>
+                          </a:stretch>
+                        </pic:blipFill>
+                        <pic:spPr>
+                          <a:xfrm>
+                            <a:off x="0" y="0"/>
+                            <a:ext cx="2112000" cy="1584000"/>
+                          </a:xfrm>
+                          <a:prstGeom prst="rect"/>
+                        </pic:spPr>
+                      </pic:pic>
+                    </a:graphicData>
+                  </a:graphic>
+                </wp:inline>
+              </w:drawing>
+            </w:r>
           </w:p>
-          <w:tbl>
-            <w:tblPr>
-              <w:tblW w:type="auto" w:w="0"/>
-              <w:tblLook w:firstColumn="1" w:firstRow="1" w:lastColumn="0" w:lastRow="0" w:noHBand="0" w:noVBand="1" w:val="04A0"/>
-              <w:tblBorders>
-                <w:top w:val="single" w:sz="8" w:color="000000"/>
-                <w:left w:val="single" w:sz="8" w:color="000000"/>
-                <w:bottom w:val="single" w:sz="8" w:color="000000"/>
-                <w:right w:val="single" w:sz="8" w:color="000000"/>
-                <w:insideH w:val="single" w:sz="8" w:color="000000"/>
-                <w:insideV w:val="single" w:sz="8" w:color="000000"/>
-              </w:tblBorders>
-            </w:tblPr>
-            <w:tblGrid>
-              <w:gridCol w:w="4649"/>
-            </w:tblGrid>
-            <w:tr>
-              <w:trPr>
-                <w:trHeight w:val="2494"/>
-              </w:trPr>
-              <w:tc>
-                <w:tcPr>
-                  <w:tcW w:type="dxa" w:w="3969"/>
-                  <w:vAlign w:val="center"/>
-                </w:tcPr>
-                <w:p>
-                  <w:pPr>
-                    <w:spacing w:after="0"/>
-                    <w:jc w:val="center"/>
-                  </w:pPr>
-                  <w:r>
-                    <w:rPr>
-                      <w:rFonts w:ascii="Arial" w:hAnsi="Arial" w:eastAsia="Arial"/>
-                      <w:b w:val="0"/>
-                      <w:i w:val="0"/>
-                      <w:sz w:val="18"/>
-                      <w:u w:val="none"/>
-                    </w:rPr>
-                    <w:t>[ tempel foto kunjungan ]</w:t>
-                  </w:r>
-                </w:p>
-              </w:tc>
-            </w:tr>
-          </w:tbl>
-          <w:p/>
           <w:p>
             <w:pPr>
               <w:spacing w:after="160"/>
@@ -2948,7 +2926,7 @@
                 <w:sz w:val="17"/>
                 <w:u w:val="none"/>
               </w:rPr>
-              <w:t>Foto 10 — Kunjungan Pertamina ke Lab IoT ITB, 6 Agustus 2026</w:t>
+              <w:t>Foto 10 — Rapat pembahasan progres GLD</w:t>
             </w:r>
           </w:p>
         </w:tc>
@@ -2962,52 +2940,41 @@
             <w:pPr>
               <w:jc w:val="center"/>
             </w:pPr>
+            <w:r>
+              <w:drawing>
+                <wp:inline xmlns:a="http://schemas.openxmlformats.org/drawingml/2006/main" xmlns:pic="http://schemas.openxmlformats.org/drawingml/2006/picture">
+                  <wp:extent cx="2112000" cy="1584000"/>
+                  <wp:docPr id="14" name="Picture 14"/>
+                  <wp:cNvGraphicFramePr>
+                    <a:graphicFrameLocks noChangeAspect="1"/>
+                  </wp:cNvGraphicFramePr>
+                  <a:graphic>
+                    <a:graphicData uri="http://schemas.openxmlformats.org/drawingml/2006/picture">
+                      <pic:pic>
+                        <pic:nvPicPr>
+                          <pic:cNvPr id="0" name="image.jpg"/>
+                          <pic:cNvPicPr/>
+                        </pic:nvPicPr>
+                        <pic:blipFill>
+                          <a:blip r:embed="rId23"/>
+                          <a:stretch>
+                            <a:fillRect/>
+                          </a:stretch>
+                        </pic:blipFill>
+                        <pic:spPr>
+                          <a:xfrm>
+                            <a:off x="0" y="0"/>
+                            <a:ext cx="2112000" cy="1584000"/>
+                          </a:xfrm>
+                          <a:prstGeom prst="rect"/>
+                        </pic:spPr>
+                      </pic:pic>
+                    </a:graphicData>
+                  </a:graphic>
+                </wp:inline>
+              </w:drawing>
+            </w:r>
           </w:p>
-          <w:tbl>
-            <w:tblPr>
-              <w:tblW w:type="auto" w:w="0"/>
-              <w:tblLook w:firstColumn="1" w:firstRow="1" w:lastColumn="0" w:lastRow="0" w:noHBand="0" w:noVBand="1" w:val="04A0"/>
-              <w:tblBorders>
-                <w:top w:val="single" w:sz="8" w:color="000000"/>
-                <w:left w:val="single" w:sz="8" w:color="000000"/>
-                <w:bottom w:val="single" w:sz="8" w:color="000000"/>
-                <w:right w:val="single" w:sz="8" w:color="000000"/>
-                <w:insideH w:val="single" w:sz="8" w:color="000000"/>
-                <w:insideV w:val="single" w:sz="8" w:color="000000"/>
-              </w:tblBorders>
-            </w:tblPr>
-            <w:tblGrid>
-              <w:gridCol w:w="4649"/>
-            </w:tblGrid>
-            <w:tr>
-              <w:trPr>
-                <w:trHeight w:val="2494"/>
-              </w:trPr>
-              <w:tc>
-                <w:tcPr>
-                  <w:tcW w:type="dxa" w:w="3969"/>
-                  <w:vAlign w:val="center"/>
-                </w:tcPr>
-                <w:p>
-                  <w:pPr>
-                    <w:spacing w:after="0"/>
-                    <w:jc w:val="center"/>
-                  </w:pPr>
-                  <w:r>
-                    <w:rPr>
-                      <w:rFonts w:ascii="Arial" w:hAnsi="Arial" w:eastAsia="Arial"/>
-                      <w:b w:val="0"/>
-                      <w:i w:val="0"/>
-                      <w:sz w:val="18"/>
-                      <w:u w:val="none"/>
-                    </w:rPr>
-                    <w:t>[ tempel foto kunjungan ]</w:t>
-                  </w:r>
-                </w:p>
-              </w:tc>
-            </w:tr>
-          </w:tbl>
-          <w:p/>
           <w:p>
             <w:pPr>
               <w:spacing w:after="160"/>
@@ -3021,7 +2988,7 @@
                 <w:sz w:val="17"/>
                 <w:u w:val="none"/>
               </w:rPr>
-              <w:t>Foto 11 — Kunjungan Pertamina ke Lab IoT ITB, 6 Agustus 2026</w:t>
+              <w:t>Foto 11 — Rapat pembahasan progres GLD</w:t>
             </w:r>
           </w:p>
         </w:tc>
@@ -3033,52 +3000,41 @@
             <w:pPr>
               <w:jc w:val="center"/>
             </w:pPr>
+            <w:r>
+              <w:drawing>
+                <wp:inline xmlns:a="http://schemas.openxmlformats.org/drawingml/2006/main" xmlns:pic="http://schemas.openxmlformats.org/drawingml/2006/picture">
+                  <wp:extent cx="2520000" cy="1416600"/>
+                  <wp:docPr id="15" name="Picture 15"/>
+                  <wp:cNvGraphicFramePr>
+                    <a:graphicFrameLocks noChangeAspect="1"/>
+                  </wp:cNvGraphicFramePr>
+                  <a:graphic>
+                    <a:graphicData uri="http://schemas.openxmlformats.org/drawingml/2006/picture">
+                      <pic:pic>
+                        <pic:nvPicPr>
+                          <pic:cNvPr id="0" name="image.jpg"/>
+                          <pic:cNvPicPr/>
+                        </pic:nvPicPr>
+                        <pic:blipFill>
+                          <a:blip r:embed="rId24"/>
+                          <a:stretch>
+                            <a:fillRect/>
+                          </a:stretch>
+                        </pic:blipFill>
+                        <pic:spPr>
+                          <a:xfrm>
+                            <a:off x="0" y="0"/>
+                            <a:ext cx="2520000" cy="1416600"/>
+                          </a:xfrm>
+                          <a:prstGeom prst="rect"/>
+                        </pic:spPr>
+                      </pic:pic>
+                    </a:graphicData>
+                  </a:graphic>
+                </wp:inline>
+              </w:drawing>
+            </w:r>
           </w:p>
-          <w:tbl>
-            <w:tblPr>
-              <w:tblW w:type="auto" w:w="0"/>
-              <w:tblLook w:firstColumn="1" w:firstRow="1" w:lastColumn="0" w:lastRow="0" w:noHBand="0" w:noVBand="1" w:val="04A0"/>
-              <w:tblBorders>
-                <w:top w:val="single" w:sz="8" w:color="000000"/>
-                <w:left w:val="single" w:sz="8" w:color="000000"/>
-                <w:bottom w:val="single" w:sz="8" w:color="000000"/>
-                <w:right w:val="single" w:sz="8" w:color="000000"/>
-                <w:insideH w:val="single" w:sz="8" w:color="000000"/>
-                <w:insideV w:val="single" w:sz="8" w:color="000000"/>
-              </w:tblBorders>
-            </w:tblPr>
-            <w:tblGrid>
-              <w:gridCol w:w="4649"/>
-            </w:tblGrid>
-            <w:tr>
-              <w:trPr>
-                <w:trHeight w:val="2494"/>
-              </w:trPr>
-              <w:tc>
-                <w:tcPr>
-                  <w:tcW w:type="dxa" w:w="3969"/>
-                  <w:vAlign w:val="center"/>
-                </w:tcPr>
-                <w:p>
-                  <w:pPr>
-                    <w:spacing w:after="0"/>
-                    <w:jc w:val="center"/>
-                  </w:pPr>
-                  <w:r>
-                    <w:rPr>
-                      <w:rFonts w:ascii="Arial" w:hAnsi="Arial" w:eastAsia="Arial"/>
-                      <w:b w:val="0"/>
-                      <w:i w:val="0"/>
-                      <w:sz w:val="18"/>
-                      <w:u w:val="none"/>
-                    </w:rPr>
-                    <w:t>[ tempel foto kunjungan ]</w:t>
-                  </w:r>
-                </w:p>
-              </w:tc>
-            </w:tr>
-          </w:tbl>
-          <w:p/>
           <w:p>
             <w:pPr>
               <w:spacing w:after="160"/>
@@ -3092,7 +3048,373 @@
                 <w:sz w:val="17"/>
                 <w:u w:val="none"/>
               </w:rPr>
-              <w:t>Foto 12 — Kunjungan Pertamina ke Lab IoT ITB, 6 Agustus 2026</w:t>
+              <w:t>Foto 12 — Paparan data 8 sensor MQ di dashboard</w:t>
+            </w:r>
+          </w:p>
+        </w:tc>
+      </w:tr>
+      <w:tr>
+        <w:tc>
+          <w:tcPr>
+            <w:tcW w:type="dxa" w:w="4649"/>
+          </w:tcPr>
+          <w:p>
+            <w:pPr>
+              <w:jc w:val="center"/>
+            </w:pPr>
+            <w:r>
+              <w:drawing>
+                <wp:inline xmlns:a="http://schemas.openxmlformats.org/drawingml/2006/main" xmlns:pic="http://schemas.openxmlformats.org/drawingml/2006/picture">
+                  <wp:extent cx="2520000" cy="1418400"/>
+                  <wp:docPr id="16" name="Picture 16"/>
+                  <wp:cNvGraphicFramePr>
+                    <a:graphicFrameLocks noChangeAspect="1"/>
+                  </wp:cNvGraphicFramePr>
+                  <a:graphic>
+                    <a:graphicData uri="http://schemas.openxmlformats.org/drawingml/2006/picture">
+                      <pic:pic>
+                        <pic:nvPicPr>
+                          <pic:cNvPr id="0" name="image.jpg"/>
+                          <pic:cNvPicPr/>
+                        </pic:nvPicPr>
+                        <pic:blipFill>
+                          <a:blip r:embed="rId25"/>
+                          <a:stretch>
+                            <a:fillRect/>
+                          </a:stretch>
+                        </pic:blipFill>
+                        <pic:spPr>
+                          <a:xfrm>
+                            <a:off x="0" y="0"/>
+                            <a:ext cx="2520000" cy="1418400"/>
+                          </a:xfrm>
+                          <a:prstGeom prst="rect"/>
+                        </pic:spPr>
+                      </pic:pic>
+                    </a:graphicData>
+                  </a:graphic>
+                </wp:inline>
+              </w:drawing>
+            </w:r>
+          </w:p>
+          <w:p>
+            <w:pPr>
+              <w:spacing w:after="160"/>
+              <w:jc w:val="center"/>
+            </w:pPr>
+            <w:r>
+              <w:rPr>
+                <w:rFonts w:ascii="Arial" w:hAnsi="Arial" w:eastAsia="Arial"/>
+                <w:b w:val="0"/>
+                <w:i/>
+                <w:sz w:val="17"/>
+                <w:u w:val="none"/>
+              </w:rPr>
+              <w:t>Foto 13 — Demonstrasi dashboard monitoring</w:t>
+            </w:r>
+          </w:p>
+        </w:tc>
+        <w:tc>
+          <w:tcPr>
+            <w:tcW w:type="dxa" w:w="4649"/>
+          </w:tcPr>
+          <w:p>
+            <w:pPr>
+              <w:jc w:val="center"/>
+            </w:pPr>
+            <w:r>
+              <w:drawing>
+                <wp:inline xmlns:a="http://schemas.openxmlformats.org/drawingml/2006/main" xmlns:pic="http://schemas.openxmlformats.org/drawingml/2006/picture">
+                  <wp:extent cx="2520000" cy="1416600"/>
+                  <wp:docPr id="17" name="Picture 17"/>
+                  <wp:cNvGraphicFramePr>
+                    <a:graphicFrameLocks noChangeAspect="1"/>
+                  </wp:cNvGraphicFramePr>
+                  <a:graphic>
+                    <a:graphicData uri="http://schemas.openxmlformats.org/drawingml/2006/picture">
+                      <pic:pic>
+                        <pic:nvPicPr>
+                          <pic:cNvPr id="0" name="image.jpg"/>
+                          <pic:cNvPicPr/>
+                        </pic:nvPicPr>
+                        <pic:blipFill>
+                          <a:blip r:embed="rId26"/>
+                          <a:stretch>
+                            <a:fillRect/>
+                          </a:stretch>
+                        </pic:blipFill>
+                        <pic:spPr>
+                          <a:xfrm>
+                            <a:off x="0" y="0"/>
+                            <a:ext cx="2520000" cy="1416600"/>
+                          </a:xfrm>
+                          <a:prstGeom prst="rect"/>
+                        </pic:spPr>
+                      </pic:pic>
+                    </a:graphicData>
+                  </a:graphic>
+                </wp:inline>
+              </w:drawing>
+            </w:r>
+          </w:p>
+          <w:p>
+            <w:pPr>
+              <w:spacing w:after="160"/>
+              <w:jc w:val="center"/>
+            </w:pPr>
+            <w:r>
+              <w:rPr>
+                <w:rFonts w:ascii="Arial" w:hAnsi="Arial" w:eastAsia="Arial"/>
+                <w:b w:val="0"/>
+                <w:i/>
+                <w:sz w:val="17"/>
+                <w:u w:val="none"/>
+              </w:rPr>
+              <w:t>Foto 14 — Peninjauan prototipe GLD dan data sensor board</w:t>
+            </w:r>
+          </w:p>
+        </w:tc>
+      </w:tr>
+      <w:tr>
+        <w:tc>
+          <w:tcPr>
+            <w:tcW w:type="dxa" w:w="4649"/>
+          </w:tcPr>
+          <w:p>
+            <w:pPr>
+              <w:jc w:val="center"/>
+            </w:pPr>
+            <w:r>
+              <w:drawing>
+                <wp:inline xmlns:a="http://schemas.openxmlformats.org/drawingml/2006/main" xmlns:pic="http://schemas.openxmlformats.org/drawingml/2006/picture">
+                  <wp:extent cx="2520000" cy="1418400"/>
+                  <wp:docPr id="18" name="Picture 18"/>
+                  <wp:cNvGraphicFramePr>
+                    <a:graphicFrameLocks noChangeAspect="1"/>
+                  </wp:cNvGraphicFramePr>
+                  <a:graphic>
+                    <a:graphicData uri="http://schemas.openxmlformats.org/drawingml/2006/picture">
+                      <pic:pic>
+                        <pic:nvPicPr>
+                          <pic:cNvPr id="0" name="image.jpg"/>
+                          <pic:cNvPicPr/>
+                        </pic:nvPicPr>
+                        <pic:blipFill>
+                          <a:blip r:embed="rId27"/>
+                          <a:stretch>
+                            <a:fillRect/>
+                          </a:stretch>
+                        </pic:blipFill>
+                        <pic:spPr>
+                          <a:xfrm>
+                            <a:off x="0" y="0"/>
+                            <a:ext cx="2520000" cy="1418400"/>
+                          </a:xfrm>
+                          <a:prstGeom prst="rect"/>
+                        </pic:spPr>
+                      </pic:pic>
+                    </a:graphicData>
+                  </a:graphic>
+                </wp:inline>
+              </w:drawing>
+            </w:r>
+          </w:p>
+          <w:p>
+            <w:pPr>
+              <w:spacing w:after="160"/>
+              <w:jc w:val="center"/>
+            </w:pPr>
+            <w:r>
+              <w:rPr>
+                <w:rFonts w:ascii="Arial" w:hAnsi="Arial" w:eastAsia="Arial"/>
+                <w:b w:val="0"/>
+                <w:i/>
+                <w:sz w:val="17"/>
+                <w:u w:val="none"/>
+              </w:rPr>
+              <w:t>Foto 15 — Peninjauan perakitan prototipe di Lab IoT ITB</w:t>
+            </w:r>
+          </w:p>
+        </w:tc>
+        <w:tc>
+          <w:tcPr>
+            <w:tcW w:type="dxa" w:w="4649"/>
+          </w:tcPr>
+          <w:p>
+            <w:pPr>
+              <w:jc w:val="center"/>
+            </w:pPr>
+            <w:r>
+              <w:drawing>
+                <wp:inline xmlns:a="http://schemas.openxmlformats.org/drawingml/2006/main" xmlns:pic="http://schemas.openxmlformats.org/drawingml/2006/picture">
+                  <wp:extent cx="890434" cy="1584000"/>
+                  <wp:docPr id="19" name="Picture 19"/>
+                  <wp:cNvGraphicFramePr>
+                    <a:graphicFrameLocks noChangeAspect="1"/>
+                  </wp:cNvGraphicFramePr>
+                  <a:graphic>
+                    <a:graphicData uri="http://schemas.openxmlformats.org/drawingml/2006/picture">
+                      <pic:pic>
+                        <pic:nvPicPr>
+                          <pic:cNvPr id="0" name="image.jpg"/>
+                          <pic:cNvPicPr/>
+                        </pic:nvPicPr>
+                        <pic:blipFill>
+                          <a:blip r:embed="rId28"/>
+                          <a:stretch>
+                            <a:fillRect/>
+                          </a:stretch>
+                        </pic:blipFill>
+                        <pic:spPr>
+                          <a:xfrm>
+                            <a:off x="0" y="0"/>
+                            <a:ext cx="890434" cy="1584000"/>
+                          </a:xfrm>
+                          <a:prstGeom prst="rect"/>
+                        </pic:spPr>
+                      </pic:pic>
+                    </a:graphicData>
+                  </a:graphic>
+                </wp:inline>
+              </w:drawing>
+            </w:r>
+          </w:p>
+          <w:p>
+            <w:pPr>
+              <w:spacing w:after="160"/>
+              <w:jc w:val="center"/>
+            </w:pPr>
+            <w:r>
+              <w:rPr>
+                <w:rFonts w:ascii="Arial" w:hAnsi="Arial" w:eastAsia="Arial"/>
+                <w:b w:val="0"/>
+                <w:i/>
+                <w:sz w:val="17"/>
+                <w:u w:val="none"/>
+              </w:rPr>
+              <w:t>Foto 16 — Peninjauan perakitan prototipe di Lab IoT ITB</w:t>
+            </w:r>
+          </w:p>
+        </w:tc>
+      </w:tr>
+      <w:tr>
+        <w:tc>
+          <w:tcPr>
+            <w:tcW w:type="dxa" w:w="4649"/>
+          </w:tcPr>
+          <w:p>
+            <w:pPr>
+              <w:jc w:val="center"/>
+            </w:pPr>
+            <w:r>
+              <w:drawing>
+                <wp:inline xmlns:a="http://schemas.openxmlformats.org/drawingml/2006/main" xmlns:pic="http://schemas.openxmlformats.org/drawingml/2006/picture">
+                  <wp:extent cx="2112000" cy="1584000"/>
+                  <wp:docPr id="20" name="Picture 20"/>
+                  <wp:cNvGraphicFramePr>
+                    <a:graphicFrameLocks noChangeAspect="1"/>
+                  </wp:cNvGraphicFramePr>
+                  <a:graphic>
+                    <a:graphicData uri="http://schemas.openxmlformats.org/drawingml/2006/picture">
+                      <pic:pic>
+                        <pic:nvPicPr>
+                          <pic:cNvPr id="0" name="image.jpg"/>
+                          <pic:cNvPicPr/>
+                        </pic:nvPicPr>
+                        <pic:blipFill>
+                          <a:blip r:embed="rId29"/>
+                          <a:stretch>
+                            <a:fillRect/>
+                          </a:stretch>
+                        </pic:blipFill>
+                        <pic:spPr>
+                          <a:xfrm>
+                            <a:off x="0" y="0"/>
+                            <a:ext cx="2112000" cy="1584000"/>
+                          </a:xfrm>
+                          <a:prstGeom prst="rect"/>
+                        </pic:spPr>
+                      </pic:pic>
+                    </a:graphicData>
+                  </a:graphic>
+                </wp:inline>
+              </w:drawing>
+            </w:r>
+          </w:p>
+          <w:p>
+            <w:pPr>
+              <w:spacing w:after="160"/>
+              <w:jc w:val="center"/>
+            </w:pPr>
+            <w:r>
+              <w:rPr>
+                <w:rFonts w:ascii="Arial" w:hAnsi="Arial" w:eastAsia="Arial"/>
+                <w:b w:val="0"/>
+                <w:i/>
+                <w:sz w:val="17"/>
+                <w:u w:val="none"/>
+              </w:rPr>
+              <w:t>Foto 17 — Rapat pembahasan progres GLD</w:t>
+            </w:r>
+          </w:p>
+        </w:tc>
+        <w:tc>
+          <w:tcPr>
+            <w:tcW w:type="dxa" w:w="4649"/>
+          </w:tcPr>
+          <w:p>
+            <w:pPr>
+              <w:jc w:val="center"/>
+            </w:pPr>
+            <w:r>
+              <w:drawing>
+                <wp:inline xmlns:a="http://schemas.openxmlformats.org/drawingml/2006/main" xmlns:pic="http://schemas.openxmlformats.org/drawingml/2006/picture">
+                  <wp:extent cx="2112000" cy="1584000"/>
+                  <wp:docPr id="21" name="Picture 21"/>
+                  <wp:cNvGraphicFramePr>
+                    <a:graphicFrameLocks noChangeAspect="1"/>
+                  </wp:cNvGraphicFramePr>
+                  <a:graphic>
+                    <a:graphicData uri="http://schemas.openxmlformats.org/drawingml/2006/picture">
+                      <pic:pic>
+                        <pic:nvPicPr>
+                          <pic:cNvPr id="0" name="image.jpg"/>
+                          <pic:cNvPicPr/>
+                        </pic:nvPicPr>
+                        <pic:blipFill>
+                          <a:blip r:embed="rId30"/>
+                          <a:stretch>
+                            <a:fillRect/>
+                          </a:stretch>
+                        </pic:blipFill>
+                        <pic:spPr>
+                          <a:xfrm>
+                            <a:off x="0" y="0"/>
+                            <a:ext cx="2112000" cy="1584000"/>
+                          </a:xfrm>
+                          <a:prstGeom prst="rect"/>
+                        </pic:spPr>
+                      </pic:pic>
+                    </a:graphicData>
+                  </a:graphic>
+                </wp:inline>
+              </w:drawing>
+            </w:r>
+          </w:p>
+          <w:p>
+            <w:pPr>
+              <w:spacing w:after="160"/>
+              <w:jc w:val="center"/>
+            </w:pPr>
+            <w:r>
+              <w:rPr>
+                <w:rFonts w:ascii="Arial" w:hAnsi="Arial" w:eastAsia="Arial"/>
+                <w:b w:val="0"/>
+                <w:i/>
+                <w:sz w:val="17"/>
+                <w:u w:val="none"/>
+              </w:rPr>
+              <w:t>Foto 18 — Rapat pembahasan progres GLD</w:t>
             </w:r>
           </w:p>
         </w:tc>

</xml_diff>

<commit_message>
SP-001: koreksi isi FAT-07, status netral 'Tersedia', rapikan lembar pengesahan
Co-Authored-By: Claude Opus 5.5 <noreply@anthropic.com>
Claude-Session: https://claude.ai/code/session_01RNmbaVJ5kQVKwCKRCRa4ED
</commit_message>
<xml_diff>
--- a/Paket LGU/03_Pemenuhan_Klausul_Termin_SP-001_Sertifikasi/Dokumen_Pemenuhan_Klausul_Termin_SP-001_Sertifikasi_GLD.docx
+++ b/Paket LGU/03_Pemenuhan_Klausul_Termin_SP-001_Sertifikasi/Dokumen_Pemenuhan_Klausul_Termin_SP-001_Sertifikasi_GLD.docx
@@ -863,7 +863,7 @@
                 <w:sz w:val="17"/>
                 <w:u w:val="none"/>
               </w:rPr>
-              <w:t>Terpenuhi</w:t>
+              <w:t>Tersedia</w:t>
             </w:r>
           </w:p>
         </w:tc>
@@ -975,7 +975,7 @@
                 <w:sz w:val="17"/>
                 <w:u w:val="none"/>
               </w:rPr>
-              <w:t>Terpenuhi</w:t>
+              <w:t>Tersedia</w:t>
             </w:r>
           </w:p>
         </w:tc>
@@ -1087,7 +1087,7 @@
                 <w:sz w:val="17"/>
                 <w:u w:val="none"/>
               </w:rPr>
-              <w:t>Terpenuhi</w:t>
+              <w:t>Tersedia</w:t>
             </w:r>
           </w:p>
         </w:tc>
@@ -1505,7 +1505,7 @@
                 <w:sz w:val="17"/>
                 <w:u w:val="none"/>
               </w:rPr>
-              <w:t>7/7 item lulus: pembacaan 8 kanal sensor, klasifikasi gas AI di perangkat (ESP32-S3), komunikasi LoRa, mesh &amp; failover Cluster Head, integrasi end-to-end, alarm otomatis, catu daya.</w:t>
+              <w:t>7/7 item lulus: pembacaan 8 kanal sensor, klasifikasi gas AI di perangkat (ESP32-S3), komunikasi LoRa, mesh &amp; failover Cluster Head, integrasi end-to-end, alarm otomatis, serta monitoring data dan alarm di dashboard.</w:t>
             </w:r>
           </w:p>
         </w:tc>
@@ -2120,43 +2120,76 @@
         <w:tc>
           <w:tcPr>
             <w:tcW w:type="dxa" w:w="4762"/>
-            <w:vAlign w:val="top"/>
           </w:tcPr>
-          <w:p>
-            <w:pPr>
-              <w:spacing w:after="0"/>
-              <w:jc w:val="center"/>
-            </w:pPr>
-            <w:r>
-              <w:rPr>
-                <w:rFonts w:ascii="Arial" w:hAnsi="Arial" w:eastAsia="Arial"/>
-                <w:b w:val="0"/>
-                <w:i w:val="0"/>
-                <w:sz w:val="18"/>
-                <w:u w:val="none"/>
-              </w:rPr>
-              <w:t>Manager Domestic Product Content &amp; Digitalization,</w:t>
-            </w:r>
-          </w:p>
           <w:p/>
+          <w:tbl>
+            <w:tblPr>
+              <w:tblW w:type="auto" w:w="0"/>
+              <w:tblLook w:firstColumn="1" w:firstRow="1" w:lastColumn="0" w:lastRow="0" w:noHBand="0" w:noVBand="1" w:val="04A0"/>
+              <w:tblLayout w:type="fixed"/>
+            </w:tblPr>
+            <w:tblGrid>
+              <w:gridCol w:w="4422"/>
+            </w:tblGrid>
+            <w:tr>
+              <w:tc>
+                <w:tcPr>
+                  <w:tcW w:type="dxa" w:w="4422"/>
+                  <w:vAlign w:val="center"/>
+                </w:tcPr>
+                <w:p>
+                  <w:pPr>
+                    <w:spacing w:after="0"/>
+                    <w:jc w:val="center"/>
+                  </w:pPr>
+                  <w:r>
+                    <w:rPr>
+                      <w:rFonts w:ascii="Arial" w:hAnsi="Arial" w:eastAsia="Arial"/>
+                      <w:b w:val="0"/>
+                      <w:i w:val="0"/>
+                      <w:sz w:val="18"/>
+                      <w:u w:val="none"/>
+                    </w:rPr>
+                    <w:t>Manager Domestic Product Content &amp; Digitalization,</w:t>
+                  </w:r>
+                </w:p>
+              </w:tc>
+            </w:tr>
+            <w:tr>
+              <w:trPr>
+                <w:trHeight w:val="1361"/>
+              </w:trPr>
+              <w:tc>
+                <w:tcPr>
+                  <w:tcW w:type="dxa" w:w="4422"/>
+                </w:tcPr>
+                <w:p/>
+              </w:tc>
+            </w:tr>
+            <w:tr>
+              <w:tc>
+                <w:tcPr>
+                  <w:tcW w:type="dxa" w:w="4422"/>
+                </w:tcPr>
+                <w:p>
+                  <w:pPr>
+                    <w:jc w:val="center"/>
+                  </w:pPr>
+                  <w:r>
+                    <w:rPr>
+                      <w:rFonts w:ascii="Arial" w:hAnsi="Arial" w:eastAsia="Arial"/>
+                      <w:b/>
+                      <w:i w:val="0"/>
+                      <w:sz w:val="18"/>
+                      <w:u w:val="single"/>
+                    </w:rPr>
+                    <w:t>Agustinus Pindoan Panjaitan</w:t>
+                  </w:r>
+                </w:p>
+              </w:tc>
+            </w:tr>
+          </w:tbl>
           <w:p/>
-          <w:p/>
-          <w:p/>
-          <w:p>
-            <w:pPr>
-              <w:jc w:val="center"/>
-            </w:pPr>
-            <w:r>
-              <w:rPr>
-                <w:rFonts w:ascii="Arial" w:hAnsi="Arial" w:eastAsia="Arial"/>
-                <w:b/>
-                <w:i w:val="0"/>
-                <w:sz w:val="18"/>
-                <w:u w:val="single"/>
-              </w:rPr>
-              <w:t>Agustinus Pindoan Panjaitan</w:t>
-            </w:r>
-          </w:p>
         </w:tc>
       </w:tr>
     </w:tbl>

</xml_diff>

<commit_message>
SP-001: rincian peningkatan per versi PCB V1-V5 dan casing menuju sertifikasi
Co-Authored-By: Claude Opus 5.5 <noreply@anthropic.com>
Claude-Session: https://claude.ai/code/session_01RNmbaVJ5kQVKwCKRCRa4ED
</commit_message>
<xml_diff>
--- a/Paket LGU/03_Pemenuhan_Klausul_Termin_SP-001_Sertifikasi/Dokumen_Pemenuhan_Klausul_Termin_SP-001_Sertifikasi_GLD.docx
+++ b/Paket LGU/03_Pemenuhan_Klausul_Termin_SP-001_Sertifikasi/Dokumen_Pemenuhan_Klausul_Termin_SP-001_Sertifikasi_GLD.docx
@@ -1666,20 +1666,9 @@
     </w:p>
     <w:p>
       <w:pPr>
-        <w:pStyle w:val="ListBullet"/>
-        <w:spacing w:after="120" w:line="276" w:lineRule="auto"/>
+        <w:spacing w:after="120" w:before="0" w:line="276" w:lineRule="auto"/>
         <w:jc w:val="both"/>
       </w:pPr>
-      <w:r>
-        <w:rPr>
-          <w:rFonts w:ascii="Arial" w:hAnsi="Arial" w:eastAsia="Arial"/>
-          <w:b/>
-          <w:i w:val="0"/>
-          <w:sz w:val="20"/>
-          <w:u w:val="none"/>
-        </w:rPr>
-        <w:t xml:space="preserve">PCB Node Sensor GLD V1 → V5. </w:t>
-      </w:r>
       <w:r>
         <w:rPr>
           <w:rFonts w:ascii="Arial" w:hAnsi="Arial" w:eastAsia="Arial"/>
@@ -1688,90 +1677,591 @@
           <w:sz w:val="20"/>
           <w:u w:val="none"/>
         </w:rPr>
-        <w:t>V2 memisahkan rangkaian sensor MQ ke sensor board dengan saklar daya; V3 memperbaiki temuan V2 (jalur catu +5VA, soket kipas 5 V); V4 menambahkan PCB cover dengan terminal kabel dan lubang baut pemasangan motherboard; V5 memisahkan fungsi akuisisi ke Sensor PCB terhubung konektor 16-pin, motherboard mempertahankan ESP32 dan watchdog (Gambar 1).</w:t>
+        <w:t>Perbaikan desain dilakukan bertahap pada dua komponen utama: papan elektronik (PCB) Node Sensor GLD dan casing/enclosure. Tabel berikut merinci perubahan setiap versi dan kontribusinya terhadap persyaratan sertifikasi hazardous area (konsep proteksi usulan Ex d, II 2G Ex db IIC T4 Gb, mengacu IEC 60079-0 dan IEC 60079-1).</w:t>
       </w:r>
     </w:p>
     <w:p>
       <w:pPr>
-        <w:pStyle w:val="ListBullet"/>
-        <w:spacing w:after="120" w:line="276" w:lineRule="auto"/>
-        <w:jc w:val="both"/>
+        <w:spacing w:after="60" w:before="120" w:line="276" w:lineRule="auto"/>
+        <w:jc w:val="left"/>
       </w:pPr>
       <w:r>
         <w:rPr>
           <w:rFonts w:ascii="Arial" w:hAnsi="Arial" w:eastAsia="Arial"/>
           <w:b/>
           <w:i w:val="0"/>
-          <w:sz w:val="20"/>
+          <w:sz w:val="18"/>
           <w:u w:val="none"/>
         </w:rPr>
-        <w:t xml:space="preserve">Casing / enclosure. </w:t>
-      </w:r>
-      <w:r>
-        <w:rPr>
-          <w:rFonts w:ascii="Arial" w:hAnsi="Arial" w:eastAsia="Arial"/>
-          <w:b w:val="0"/>
-          <w:i w:val="0"/>
-          <w:sz w:val="20"/>
-          <w:u w:val="none"/>
-        </w:rPr>
-        <w:t>Berkembang dari ATEX Casing v2 ke GLD ATEX Case v3 (8 September 2026) dengan tutup ber-mesh stainless steel, kipas DC, dan dimensi yang disesuaikan untuk konsep proteksi Ex d.</w:t>
+        <w:t>Tabel 1. Iterasi PCB Node Sensor GLD dan kontribusinya menuju sertifikasi</w:t>
       </w:r>
     </w:p>
-    <w:p>
-      <w:pPr>
-        <w:pStyle w:val="ListBullet"/>
-        <w:spacing w:after="120" w:line="276" w:lineRule="auto"/>
-        <w:jc w:val="both"/>
-      </w:pPr>
-      <w:r>
-        <w:rPr>
-          <w:rFonts w:ascii="Arial" w:hAnsi="Arial" w:eastAsia="Arial"/>
-          <w:b/>
-          <w:i w:val="0"/>
-          <w:sz w:val="20"/>
-          <w:u w:val="none"/>
-        </w:rPr>
-        <w:t xml:space="preserve">Antena dan tata letak. </w:t>
-      </w:r>
-      <w:r>
-        <w:rPr>
-          <w:rFonts w:ascii="Arial" w:hAnsi="Arial" w:eastAsia="Arial"/>
-          <w:b w:val="0"/>
-          <w:i w:val="0"/>
-          <w:sz w:val="20"/>
-          <w:u w:val="none"/>
-        </w:rPr>
-        <w:t>Antena LoRa dipindah dari sisi samping ke muka atas base; posisi nameplate ditetapkan di samping antena (bandingkan Foto 7–8 dengan Foto 1–2).</w:t>
-      </w:r>
-    </w:p>
-    <w:p>
-      <w:pPr>
-        <w:pStyle w:val="ListBullet"/>
-        <w:spacing w:after="120" w:line="276" w:lineRule="auto"/>
-        <w:jc w:val="both"/>
-      </w:pPr>
-      <w:r>
-        <w:rPr>
-          <w:rFonts w:ascii="Arial" w:hAnsi="Arial" w:eastAsia="Arial"/>
-          <w:b/>
-          <w:i w:val="0"/>
-          <w:sz w:val="20"/>
-          <w:u w:val="none"/>
-        </w:rPr>
-        <w:t xml:space="preserve">Arah sertifikasi. </w:t>
-      </w:r>
-      <w:r>
-        <w:rPr>
-          <w:rFonts w:ascii="Arial" w:hAnsi="Arial" w:eastAsia="Arial"/>
-          <w:b w:val="0"/>
-          <w:i w:val="0"/>
-          <w:sz w:val="20"/>
-          <w:u w:val="none"/>
-        </w:rPr>
-        <w:t>Konsep proteksi Ex d, marking usulan II 2G Ex db IIC T4 Gb; formulir aplikasi dan dossier teknis telah diajukan ke GTS (agen sertifikasi) sekitar 29 September 2026, dan surat pengantar sampel S/N GLD2-0x1001 ke GTS Shanghai diterbitkan 12 Oktober 2026.</w:t>
-      </w:r>
-    </w:p>
+    <w:tbl>
+      <w:tblPr>
+        <w:tblW w:type="auto" w:w="0"/>
+        <w:jc w:val="center"/>
+        <w:tblLook w:firstColumn="1" w:firstRow="1" w:lastColumn="0" w:lastRow="0" w:noHBand="0" w:noVBand="1" w:val="04A0"/>
+        <w:tblBorders>
+          <w:top w:val="single" w:sz="6" w:color="000000"/>
+          <w:left w:val="single" w:sz="6" w:color="000000"/>
+          <w:bottom w:val="single" w:sz="6" w:color="000000"/>
+          <w:right w:val="single" w:sz="6" w:color="000000"/>
+          <w:insideH w:val="single" w:sz="6" w:color="000000"/>
+          <w:insideV w:val="single" w:sz="6" w:color="000000"/>
+        </w:tblBorders>
+        <w:tblLayout w:type="fixed"/>
+      </w:tblPr>
+      <w:tblGrid>
+        <w:gridCol w:w="1304"/>
+        <w:gridCol w:w="1361"/>
+        <w:gridCol w:w="3402"/>
+        <w:gridCol w:w="3458"/>
+      </w:tblGrid>
+      <w:tr>
+        <w:tc>
+          <w:tcPr>
+            <w:tcW w:type="dxa" w:w="1304"/>
+            <w:vAlign w:val="center"/>
+            <w:shd w:val="clear" w:color="auto" w:fill="D9E2F3"/>
+          </w:tcPr>
+          <w:p>
+            <w:pPr>
+              <w:spacing w:after="0"/>
+              <w:jc w:val="center"/>
+            </w:pPr>
+            <w:r>
+              <w:rPr>
+                <w:rFonts w:ascii="Arial" w:hAnsi="Arial" w:eastAsia="Arial"/>
+                <w:b/>
+                <w:i w:val="0"/>
+                <w:sz w:val="18"/>
+                <w:u w:val="none"/>
+              </w:rPr>
+              <w:t>Versi</w:t>
+            </w:r>
+          </w:p>
+        </w:tc>
+        <w:tc>
+          <w:tcPr>
+            <w:tcW w:type="dxa" w:w="1361"/>
+            <w:vAlign w:val="center"/>
+            <w:shd w:val="clear" w:color="auto" w:fill="D9E2F3"/>
+          </w:tcPr>
+          <w:p>
+            <w:pPr>
+              <w:spacing w:after="0"/>
+              <w:jc w:val="center"/>
+            </w:pPr>
+            <w:r>
+              <w:rPr>
+                <w:rFonts w:ascii="Arial" w:hAnsi="Arial" w:eastAsia="Arial"/>
+                <w:b/>
+                <w:i w:val="0"/>
+                <w:sz w:val="18"/>
+                <w:u w:val="none"/>
+              </w:rPr>
+              <w:t>Fokus</w:t>
+            </w:r>
+          </w:p>
+        </w:tc>
+        <w:tc>
+          <w:tcPr>
+            <w:tcW w:type="dxa" w:w="3402"/>
+            <w:vAlign w:val="center"/>
+            <w:shd w:val="clear" w:color="auto" w:fill="D9E2F3"/>
+          </w:tcPr>
+          <w:p>
+            <w:pPr>
+              <w:spacing w:after="0"/>
+              <w:jc w:val="center"/>
+            </w:pPr>
+            <w:r>
+              <w:rPr>
+                <w:rFonts w:ascii="Arial" w:hAnsi="Arial" w:eastAsia="Arial"/>
+                <w:b/>
+                <w:i w:val="0"/>
+                <w:sz w:val="18"/>
+                <w:u w:val="none"/>
+              </w:rPr>
+              <w:t>Perubahan yang dilakukan</w:t>
+            </w:r>
+          </w:p>
+        </w:tc>
+        <w:tc>
+          <w:tcPr>
+            <w:tcW w:type="dxa" w:w="3458"/>
+            <w:vAlign w:val="center"/>
+            <w:shd w:val="clear" w:color="auto" w:fill="D9E2F3"/>
+          </w:tcPr>
+          <w:p>
+            <w:pPr>
+              <w:spacing w:after="0"/>
+              <w:jc w:val="center"/>
+            </w:pPr>
+            <w:r>
+              <w:rPr>
+                <w:rFonts w:ascii="Arial" w:hAnsi="Arial" w:eastAsia="Arial"/>
+                <w:b/>
+                <w:i w:val="0"/>
+                <w:sz w:val="18"/>
+                <w:u w:val="none"/>
+              </w:rPr>
+              <w:t>Peningkatan menuju sertifikasi</w:t>
+            </w:r>
+          </w:p>
+        </w:tc>
+      </w:tr>
+      <w:tr>
+        <w:tc>
+          <w:tcPr>
+            <w:tcW w:type="dxa" w:w="1304"/>
+            <w:vAlign w:val="center"/>
+          </w:tcPr>
+          <w:p>
+            <w:pPr>
+              <w:spacing w:after="0"/>
+              <w:jc w:val="center"/>
+            </w:pPr>
+            <w:r>
+              <w:rPr>
+                <w:rFonts w:ascii="Arial" w:hAnsi="Arial" w:eastAsia="Arial"/>
+                <w:b/>
+                <w:i w:val="0"/>
+                <w:sz w:val="17"/>
+                <w:u w:val="none"/>
+              </w:rPr>
+              <w:t>V1</w:t>
+            </w:r>
+          </w:p>
+        </w:tc>
+        <w:tc>
+          <w:tcPr>
+            <w:tcW w:type="dxa" w:w="1361"/>
+            <w:vAlign w:val="center"/>
+          </w:tcPr>
+          <w:p>
+            <w:pPr>
+              <w:spacing w:after="0"/>
+              <w:jc w:val="left"/>
+            </w:pPr>
+            <w:r>
+              <w:rPr>
+                <w:rFonts w:ascii="Arial" w:hAnsi="Arial" w:eastAsia="Arial"/>
+                <w:b/>
+                <w:i w:val="0"/>
+                <w:sz w:val="17"/>
+                <w:u w:val="none"/>
+              </w:rPr>
+              <w:t>Baseline</w:t>
+            </w:r>
+          </w:p>
+        </w:tc>
+        <w:tc>
+          <w:tcPr>
+            <w:tcW w:type="dxa" w:w="3402"/>
+            <w:vAlign w:val="center"/>
+          </w:tcPr>
+          <w:p>
+            <w:pPr>
+              <w:spacing w:after="0"/>
+              <w:jc w:val="left"/>
+            </w:pPr>
+            <w:r>
+              <w:rPr>
+                <w:rFonts w:ascii="Arial" w:hAnsi="Arial" w:eastAsia="Arial"/>
+                <w:b w:val="0"/>
+                <w:i w:val="0"/>
+                <w:sz w:val="17"/>
+                <w:u w:val="none"/>
+              </w:rPr>
+              <w:t>ESP32, ADC ADS1256, multiplexer TCA9548, DAC MCP4725, jalur analog INA333/OPA333/LM321 serta bridge sensor MQ berada pada satu motherboard. ULN2003 menggerakkan buzzer, alarm 5 V, dan kipas DC; TPL5010 mengatur watchdog/wake-up.</w:t>
+            </w:r>
+          </w:p>
+        </w:tc>
+        <w:tc>
+          <w:tcPr>
+            <w:tcW w:type="dxa" w:w="3458"/>
+            <w:vAlign w:val="center"/>
+          </w:tcPr>
+          <w:p>
+            <w:pPr>
+              <w:spacing w:after="0"/>
+              <w:jc w:val="left"/>
+            </w:pPr>
+            <w:r>
+              <w:rPr>
+                <w:rFonts w:ascii="Arial" w:hAnsi="Arial" w:eastAsia="Arial"/>
+                <w:b w:val="0"/>
+                <w:i w:val="0"/>
+                <w:sz w:val="17"/>
+                <w:u w:val="none"/>
+              </w:rPr>
+              <w:t>Membuktikan fungsi dasar (akuisisi 8 sensor, AI, LoRa). Menjadi acuan identifikasi masalah: heater sensor MQ (sumber panas utama) bercampur dengan elektronika digital di satu papan.</w:t>
+            </w:r>
+          </w:p>
+        </w:tc>
+      </w:tr>
+      <w:tr>
+        <w:tc>
+          <w:tcPr>
+            <w:tcW w:type="dxa" w:w="1304"/>
+            <w:vAlign w:val="center"/>
+          </w:tcPr>
+          <w:p>
+            <w:pPr>
+              <w:spacing w:after="0"/>
+              <w:jc w:val="center"/>
+            </w:pPr>
+            <w:r>
+              <w:rPr>
+                <w:rFonts w:ascii="Arial" w:hAnsi="Arial" w:eastAsia="Arial"/>
+                <w:b/>
+                <w:i w:val="0"/>
+                <w:sz w:val="17"/>
+                <w:u w:val="none"/>
+              </w:rPr>
+              <w:t>V2</w:t>
+            </w:r>
+          </w:p>
+        </w:tc>
+        <w:tc>
+          <w:tcPr>
+            <w:tcW w:type="dxa" w:w="1361"/>
+            <w:vAlign w:val="center"/>
+          </w:tcPr>
+          <w:p>
+            <w:pPr>
+              <w:spacing w:after="0"/>
+              <w:jc w:val="left"/>
+            </w:pPr>
+            <w:r>
+              <w:rPr>
+                <w:rFonts w:ascii="Arial" w:hAnsi="Arial" w:eastAsia="Arial"/>
+                <w:b/>
+                <w:i w:val="0"/>
+                <w:sz w:val="17"/>
+                <w:u w:val="none"/>
+              </w:rPr>
+              <w:t>Pemisahan sensor</w:t>
+            </w:r>
+          </w:p>
+        </w:tc>
+        <w:tc>
+          <w:tcPr>
+            <w:tcW w:type="dxa" w:w="3402"/>
+            <w:vAlign w:val="center"/>
+          </w:tcPr>
+          <w:p>
+            <w:pPr>
+              <w:spacing w:after="0"/>
+              <w:jc w:val="left"/>
+            </w:pPr>
+            <w:r>
+              <w:rPr>
+                <w:rFonts w:ascii="Arial" w:hAnsi="Arial" w:eastAsia="Arial"/>
+                <w:b w:val="0"/>
+                <w:i w:val="0"/>
+                <w:sz w:val="17"/>
+                <w:u w:val="none"/>
+              </w:rPr>
+              <w:t>Bridge sensor MQ, INA333, dan MCP4725 dipindah ke SensorBoardMQ terpisah dengan saklar daya TPS22919; LM321 diganti OPA320; ditambah PCF8574 (ekspander I/O) dan SHT40 (suhu &amp; kelembapan internal). Pin alarm 24 V; pemilih catu 24 V/baterai/5 V tanpa jumper.</w:t>
+            </w:r>
+          </w:p>
+        </w:tc>
+        <w:tc>
+          <w:tcPr>
+            <w:tcW w:type="dxa" w:w="3458"/>
+            <w:vAlign w:val="center"/>
+          </w:tcPr>
+          <w:p>
+            <w:pPr>
+              <w:spacing w:after="0"/>
+              <w:jc w:val="left"/>
+            </w:pPr>
+            <w:r>
+              <w:rPr>
+                <w:rFonts w:ascii="Arial" w:hAnsi="Arial" w:eastAsia="Arial"/>
+                <w:b w:val="0"/>
+                <w:i w:val="0"/>
+                <w:sz w:val="17"/>
+                <w:u w:val="none"/>
+              </w:rPr>
+              <w:t>Sumber panas (heater MQ) dipisahkan dari logika dan dayanya dapat diputus terkendali, mendukung pengendalian suhu permukaan (kelas suhu T4) dan pembatasan energi saat gangguan. SHT40 memberi pemantauan suhu/kelembapan di dalam enclosure. Pemilih catu tanpa jumper mengurangi risiko salah konfigurasi di lapangan.</w:t>
+            </w:r>
+          </w:p>
+        </w:tc>
+      </w:tr>
+      <w:tr>
+        <w:tc>
+          <w:tcPr>
+            <w:tcW w:type="dxa" w:w="1304"/>
+            <w:vAlign w:val="center"/>
+          </w:tcPr>
+          <w:p>
+            <w:pPr>
+              <w:spacing w:after="0"/>
+              <w:jc w:val="center"/>
+            </w:pPr>
+            <w:r>
+              <w:rPr>
+                <w:rFonts w:ascii="Arial" w:hAnsi="Arial" w:eastAsia="Arial"/>
+                <w:b/>
+                <w:i w:val="0"/>
+                <w:sz w:val="17"/>
+                <w:u w:val="none"/>
+              </w:rPr>
+              <w:t>V3</w:t>
+            </w:r>
+          </w:p>
+        </w:tc>
+        <w:tc>
+          <w:tcPr>
+            <w:tcW w:type="dxa" w:w="1361"/>
+            <w:vAlign w:val="center"/>
+          </w:tcPr>
+          <w:p>
+            <w:pPr>
+              <w:spacing w:after="0"/>
+              <w:jc w:val="left"/>
+            </w:pPr>
+            <w:r>
+              <w:rPr>
+                <w:rFonts w:ascii="Arial" w:hAnsi="Arial" w:eastAsia="Arial"/>
+                <w:b/>
+                <w:i w:val="0"/>
+                <w:sz w:val="17"/>
+                <w:u w:val="none"/>
+              </w:rPr>
+              <w:t>Perbaikan temuan V2</w:t>
+            </w:r>
+          </w:p>
+        </w:tc>
+        <w:tc>
+          <w:tcPr>
+            <w:tcW w:type="dxa" w:w="3402"/>
+            <w:vAlign w:val="center"/>
+          </w:tcPr>
+          <w:p>
+            <w:pPr>
+              <w:spacing w:after="0"/>
+              <w:jc w:val="left"/>
+            </w:pPr>
+            <w:r>
+              <w:rPr>
+                <w:rFonts w:ascii="Arial" w:hAnsi="Arial" w:eastAsia="Arial"/>
+                <w:b w:val="0"/>
+                <w:i w:val="0"/>
+                <w:sz w:val="17"/>
+                <w:u w:val="none"/>
+              </w:rPr>
+              <w:t>Jalur catu +5VA disambungkan dan diperbaiki; soket kipas DC 5 V dikembalikan. Konfigurasi sensor module, OPA320, ADS1256, TCA9548, PCF8574, dan SHT40 dipertahankan.</w:t>
+            </w:r>
+          </w:p>
+        </w:tc>
+        <w:tc>
+          <w:tcPr>
+            <w:tcW w:type="dxa" w:w="3458"/>
+            <w:vAlign w:val="center"/>
+          </w:tcPr>
+          <w:p>
+            <w:pPr>
+              <w:spacing w:after="0"/>
+              <w:jc w:val="left"/>
+            </w:pPr>
+            <w:r>
+              <w:rPr>
+                <w:rFonts w:ascii="Arial" w:hAnsi="Arial" w:eastAsia="Arial"/>
+                <w:b w:val="0"/>
+                <w:i w:val="0"/>
+                <w:sz w:val="17"/>
+                <w:u w:val="none"/>
+              </w:rPr>
+              <w:t>Menutup temuan uji pada V2 (siklus uji → koreksi → uji ulang). Kipas DC diperlukan untuk aliran gas ke sensor dan pendinginan; kondisi kipas mati menjadi kasus terburuk pada uji termal 30 Sep 2026.</w:t>
+            </w:r>
+          </w:p>
+        </w:tc>
+      </w:tr>
+      <w:tr>
+        <w:tc>
+          <w:tcPr>
+            <w:tcW w:type="dxa" w:w="1304"/>
+            <w:vAlign w:val="center"/>
+          </w:tcPr>
+          <w:p>
+            <w:pPr>
+              <w:spacing w:after="0"/>
+              <w:jc w:val="center"/>
+            </w:pPr>
+            <w:r>
+              <w:rPr>
+                <w:rFonts w:ascii="Arial" w:hAnsi="Arial" w:eastAsia="Arial"/>
+                <w:b/>
+                <w:i w:val="0"/>
+                <w:sz w:val="17"/>
+                <w:u w:val="none"/>
+              </w:rPr>
+              <w:t>V4</w:t>
+            </w:r>
+          </w:p>
+        </w:tc>
+        <w:tc>
+          <w:tcPr>
+            <w:tcW w:type="dxa" w:w="1361"/>
+            <w:vAlign w:val="center"/>
+          </w:tcPr>
+          <w:p>
+            <w:pPr>
+              <w:spacing w:after="0"/>
+              <w:jc w:val="left"/>
+            </w:pPr>
+            <w:r>
+              <w:rPr>
+                <w:rFonts w:ascii="Arial" w:hAnsi="Arial" w:eastAsia="Arial"/>
+                <w:b/>
+                <w:i w:val="0"/>
+                <w:sz w:val="17"/>
+                <w:u w:val="none"/>
+              </w:rPr>
+              <w:t>Kesiapan mekanik &amp; terminal</w:t>
+            </w:r>
+          </w:p>
+        </w:tc>
+        <w:tc>
+          <w:tcPr>
+            <w:tcW w:type="dxa" w:w="3402"/>
+            <w:vAlign w:val="center"/>
+          </w:tcPr>
+          <w:p>
+            <w:pPr>
+              <w:spacing w:after="0"/>
+              <w:jc w:val="left"/>
+            </w:pPr>
+            <w:r>
+              <w:rPr>
+                <w:rFonts w:ascii="Arial" w:hAnsi="Arial" w:eastAsia="Arial"/>
+                <w:b w:val="0"/>
+                <w:i w:val="0"/>
+                <w:sz w:val="17"/>
+                <w:u w:val="none"/>
+              </w:rPr>
+              <w:t>Lubang baut untuk mengikat motherboard ke PCB cover; PCB cover terpisah sebagai modul terminal (24V +/−, ALARM −/+, RS485 A/B, FAN 5V/0V, BAT −/+) yang sekaligus menutup motherboard. Versi ini dipakai pada unit sampel S/N GLD2-0x1001.</w:t>
+            </w:r>
+          </w:p>
+        </w:tc>
+        <w:tc>
+          <w:tcPr>
+            <w:tcW w:type="dxa" w:w="3458"/>
+            <w:vAlign w:val="center"/>
+          </w:tcPr>
+          <w:p>
+            <w:pPr>
+              <w:spacing w:after="0"/>
+              <w:jc w:val="left"/>
+            </w:pPr>
+            <w:r>
+              <w:rPr>
+                <w:rFonts w:ascii="Arial" w:hAnsi="Arial" w:eastAsia="Arial"/>
+                <w:b w:val="0"/>
+                <w:i w:val="0"/>
+                <w:sz w:val="17"/>
+                <w:u w:val="none"/>
+              </w:rPr>
+              <w:t>Komponen internal terikat kuat (tahan getaran, jarak bebas terjaga) sebagaimana dituntut konstruksi Ex d. Kabel lapangan hanya menyentuh terminal berlabel, terpisah dari elektronika, sehingga diagram pengawatan dan instruksi instalasi untuk dossier dapat ditetapkan jelas.</w:t>
+            </w:r>
+          </w:p>
+        </w:tc>
+      </w:tr>
+      <w:tr>
+        <w:tc>
+          <w:tcPr>
+            <w:tcW w:type="dxa" w:w="1304"/>
+            <w:vAlign w:val="center"/>
+          </w:tcPr>
+          <w:p>
+            <w:pPr>
+              <w:spacing w:after="0"/>
+              <w:jc w:val="center"/>
+            </w:pPr>
+            <w:r>
+              <w:rPr>
+                <w:rFonts w:ascii="Arial" w:hAnsi="Arial" w:eastAsia="Arial"/>
+                <w:b/>
+                <w:i w:val="0"/>
+                <w:sz w:val="17"/>
+                <w:u w:val="none"/>
+              </w:rPr>
+              <w:t>V5</w:t>
+            </w:r>
+          </w:p>
+        </w:tc>
+        <w:tc>
+          <w:tcPr>
+            <w:tcW w:type="dxa" w:w="1361"/>
+            <w:vAlign w:val="center"/>
+          </w:tcPr>
+          <w:p>
+            <w:pPr>
+              <w:spacing w:after="0"/>
+              <w:jc w:val="left"/>
+            </w:pPr>
+            <w:r>
+              <w:rPr>
+                <w:rFonts w:ascii="Arial" w:hAnsi="Arial" w:eastAsia="Arial"/>
+                <w:b/>
+                <w:i w:val="0"/>
+                <w:sz w:val="17"/>
+                <w:u w:val="none"/>
+              </w:rPr>
+              <w:t>Modularisasi</w:t>
+            </w:r>
+          </w:p>
+        </w:tc>
+        <w:tc>
+          <w:tcPr>
+            <w:tcW w:type="dxa" w:w="3402"/>
+            <w:vAlign w:val="center"/>
+          </w:tcPr>
+          <w:p>
+            <w:pPr>
+              <w:spacing w:after="0"/>
+              <w:jc w:val="left"/>
+            </w:pPr>
+            <w:r>
+              <w:rPr>
+                <w:rFonts w:ascii="Arial" w:hAnsi="Arial" w:eastAsia="Arial"/>
+                <w:b w:val="0"/>
+                <w:i w:val="0"/>
+                <w:sz w:val="17"/>
+                <w:u w:val="none"/>
+              </w:rPr>
+              <w:t>MotherBoardAdapter hanya memuat ESP32 dan watchdog TPL5010; fungsi akuisisi (ADS1256, TCA9548, OPA320, PCF8574, SHT40, +5VA) dipindah ke Sensor PCB melalui konektor 16-pin PHD2.0.</w:t>
+            </w:r>
+          </w:p>
+        </w:tc>
+        <w:tc>
+          <w:tcPr>
+            <w:tcW w:type="dxa" w:w="3458"/>
+            <w:vAlign w:val="center"/>
+          </w:tcPr>
+          <w:p>
+            <w:pPr>
+              <w:spacing w:after="0"/>
+              <w:jc w:val="left"/>
+            </w:pPr>
+            <w:r>
+              <w:rPr>
+                <w:rFonts w:ascii="Arial" w:hAnsi="Arial" w:eastAsia="Arial"/>
+                <w:b w:val="0"/>
+                <w:i w:val="0"/>
+                <w:sz w:val="17"/>
+                <w:u w:val="none"/>
+              </w:rPr>
+              <w:t>Jalur analog/akuisisi terpisah dari prosesor, memudahkan pengujian per modul, penelusuran komponen kritis (BOM Ex-critical), dan penggantian modul tanpa mengubah papan utama. Disiapkan untuk iterasi produksi berikutnya.</w:t>
+            </w:r>
+          </w:p>
+        </w:tc>
+      </w:tr>
+    </w:tbl>
     <w:p>
       <w:pPr>
         <w:keepNext/>
@@ -1830,7 +2320,905 @@
     </w:p>
     <w:p>
       <w:pPr>
+        <w:spacing w:after="60" w:before="120" w:line="276" w:lineRule="auto"/>
+        <w:jc w:val="left"/>
+      </w:pPr>
+      <w:r>
+        <w:rPr>
+          <w:rFonts w:ascii="Arial" w:hAnsi="Arial" w:eastAsia="Arial"/>
+          <w:b/>
+          <w:i w:val="0"/>
+          <w:sz w:val="18"/>
+          <w:u w:val="none"/>
+        </w:rPr>
+        <w:t>Tabel 2. Iterasi casing/enclosure GLD dan kontribusinya menuju sertifikasi</w:t>
+      </w:r>
+    </w:p>
+    <w:tbl>
+      <w:tblPr>
+        <w:tblW w:type="auto" w:w="0"/>
+        <w:jc w:val="center"/>
+        <w:tblLook w:firstColumn="1" w:firstRow="1" w:lastColumn="0" w:lastRow="0" w:noHBand="0" w:noVBand="1" w:val="04A0"/>
+        <w:tblBorders>
+          <w:top w:val="single" w:sz="6" w:color="000000"/>
+          <w:left w:val="single" w:sz="6" w:color="000000"/>
+          <w:bottom w:val="single" w:sz="6" w:color="000000"/>
+          <w:right w:val="single" w:sz="6" w:color="000000"/>
+          <w:insideH w:val="single" w:sz="6" w:color="000000"/>
+          <w:insideV w:val="single" w:sz="6" w:color="000000"/>
+        </w:tblBorders>
+        <w:tblLayout w:type="fixed"/>
+      </w:tblPr>
+      <w:tblGrid>
+        <w:gridCol w:w="1304"/>
+        <w:gridCol w:w="1361"/>
+        <w:gridCol w:w="3402"/>
+        <w:gridCol w:w="3458"/>
+      </w:tblGrid>
+      <w:tr>
+        <w:tc>
+          <w:tcPr>
+            <w:tcW w:type="dxa" w:w="1304"/>
+            <w:vAlign w:val="center"/>
+            <w:shd w:val="clear" w:color="auto" w:fill="D9E2F3"/>
+          </w:tcPr>
+          <w:p>
+            <w:pPr>
+              <w:spacing w:after="0"/>
+              <w:jc w:val="center"/>
+            </w:pPr>
+            <w:r>
+              <w:rPr>
+                <w:rFonts w:ascii="Arial" w:hAnsi="Arial" w:eastAsia="Arial"/>
+                <w:b/>
+                <w:i w:val="0"/>
+                <w:sz w:val="18"/>
+                <w:u w:val="none"/>
+              </w:rPr>
+              <w:t>Versi</w:t>
+            </w:r>
+          </w:p>
+        </w:tc>
+        <w:tc>
+          <w:tcPr>
+            <w:tcW w:type="dxa" w:w="1361"/>
+            <w:vAlign w:val="center"/>
+            <w:shd w:val="clear" w:color="auto" w:fill="D9E2F3"/>
+          </w:tcPr>
+          <w:p>
+            <w:pPr>
+              <w:spacing w:after="0"/>
+              <w:jc w:val="center"/>
+            </w:pPr>
+            <w:r>
+              <w:rPr>
+                <w:rFonts w:ascii="Arial" w:hAnsi="Arial" w:eastAsia="Arial"/>
+                <w:b/>
+                <w:i w:val="0"/>
+                <w:sz w:val="18"/>
+                <w:u w:val="none"/>
+              </w:rPr>
+              <w:t>Fokus</w:t>
+            </w:r>
+          </w:p>
+        </w:tc>
+        <w:tc>
+          <w:tcPr>
+            <w:tcW w:type="dxa" w:w="3402"/>
+            <w:vAlign w:val="center"/>
+            <w:shd w:val="clear" w:color="auto" w:fill="D9E2F3"/>
+          </w:tcPr>
+          <w:p>
+            <w:pPr>
+              <w:spacing w:after="0"/>
+              <w:jc w:val="center"/>
+            </w:pPr>
+            <w:r>
+              <w:rPr>
+                <w:rFonts w:ascii="Arial" w:hAnsi="Arial" w:eastAsia="Arial"/>
+                <w:b/>
+                <w:i w:val="0"/>
+                <w:sz w:val="18"/>
+                <w:u w:val="none"/>
+              </w:rPr>
+              <w:t>Perubahan yang dilakukan</w:t>
+            </w:r>
+          </w:p>
+        </w:tc>
+        <w:tc>
+          <w:tcPr>
+            <w:tcW w:type="dxa" w:w="3458"/>
+            <w:vAlign w:val="center"/>
+            <w:shd w:val="clear" w:color="auto" w:fill="D9E2F3"/>
+          </w:tcPr>
+          <w:p>
+            <w:pPr>
+              <w:spacing w:after="0"/>
+              <w:jc w:val="center"/>
+            </w:pPr>
+            <w:r>
+              <w:rPr>
+                <w:rFonts w:ascii="Arial" w:hAnsi="Arial" w:eastAsia="Arial"/>
+                <w:b/>
+                <w:i w:val="0"/>
+                <w:sz w:val="18"/>
+                <w:u w:val="none"/>
+              </w:rPr>
+              <w:t>Peningkatan menuju sertifikasi</w:t>
+            </w:r>
+          </w:p>
+        </w:tc>
+      </w:tr>
+      <w:tr>
+        <w:tc>
+          <w:tcPr>
+            <w:tcW w:type="dxa" w:w="1304"/>
+            <w:vAlign w:val="center"/>
+          </w:tcPr>
+          <w:p>
+            <w:pPr>
+              <w:spacing w:after="0"/>
+              <w:jc w:val="center"/>
+            </w:pPr>
+            <w:r>
+              <w:rPr>
+                <w:rFonts w:ascii="Arial" w:hAnsi="Arial" w:eastAsia="Arial"/>
+                <w:b/>
+                <w:i w:val="0"/>
+                <w:sz w:val="17"/>
+                <w:u w:val="none"/>
+              </w:rPr>
+              <w:t>Tahap 1</w:t>
+            </w:r>
+            <w:r>
+              <w:br/>
+            </w:r>
+            <w:r>
+              <w:rPr>
+                <w:rFonts w:ascii="Arial" w:hAnsi="Arial" w:eastAsia="Arial"/>
+                <w:b/>
+                <w:i w:val="0"/>
+                <w:sz w:val="17"/>
+                <w:u w:val="none"/>
+              </w:rPr>
+              <w:t>(s/d Agu 2026)</w:t>
+            </w:r>
+          </w:p>
+        </w:tc>
+        <w:tc>
+          <w:tcPr>
+            <w:tcW w:type="dxa" w:w="1361"/>
+            <w:vAlign w:val="center"/>
+          </w:tcPr>
+          <w:p>
+            <w:pPr>
+              <w:spacing w:after="0"/>
+              <w:jc w:val="left"/>
+            </w:pPr>
+            <w:r>
+              <w:rPr>
+                <w:rFonts w:ascii="Arial" w:hAnsi="Arial" w:eastAsia="Arial"/>
+                <w:b/>
+                <w:i w:val="0"/>
+                <w:sz w:val="17"/>
+                <w:u w:val="none"/>
+              </w:rPr>
+              <w:t>Prototipe awal</w:t>
+            </w:r>
+          </w:p>
+        </w:tc>
+        <w:tc>
+          <w:tcPr>
+            <w:tcW w:type="dxa" w:w="3402"/>
+            <w:vAlign w:val="center"/>
+          </w:tcPr>
+          <w:p>
+            <w:pPr>
+              <w:spacing w:after="0"/>
+              <w:jc w:val="left"/>
+            </w:pPr>
+            <w:r>
+              <w:rPr>
+                <w:rFonts w:ascii="Arial" w:hAnsi="Arial" w:eastAsia="Arial"/>
+                <w:b w:val="0"/>
+                <w:i w:val="0"/>
+                <w:sz w:val="17"/>
+                <w:u w:val="none"/>
+              </w:rPr>
+              <w:t>Kotak junction box dengan kepala sensor silinder aluminium di bagian bawah; antena LoRa di sisi samping; beacon alarm terpisah (Foto 7–8).</w:t>
+            </w:r>
+          </w:p>
+        </w:tc>
+        <w:tc>
+          <w:tcPr>
+            <w:tcW w:type="dxa" w:w="3458"/>
+            <w:vAlign w:val="center"/>
+          </w:tcPr>
+          <w:p>
+            <w:pPr>
+              <w:spacing w:after="0"/>
+              <w:jc w:val="left"/>
+            </w:pPr>
+            <w:r>
+              <w:rPr>
+                <w:rFonts w:ascii="Arial" w:hAnsi="Arial" w:eastAsia="Arial"/>
+                <w:b w:val="0"/>
+                <w:i w:val="0"/>
+                <w:sz w:val="17"/>
+                <w:u w:val="none"/>
+              </w:rPr>
+              <w:t>Membuktikan fungsi sistem lengkap di lab dan saat disaksikan Pertamina 6 Agu 2026. Menjadi dasar identifikasi kebutuhan enclosure tahan ledakan yang ringkas.</w:t>
+            </w:r>
+          </w:p>
+        </w:tc>
+      </w:tr>
+      <w:tr>
+        <w:tc>
+          <w:tcPr>
+            <w:tcW w:type="dxa" w:w="1304"/>
+            <w:vAlign w:val="center"/>
+          </w:tcPr>
+          <w:p>
+            <w:pPr>
+              <w:spacing w:after="0"/>
+              <w:jc w:val="center"/>
+            </w:pPr>
+            <w:r>
+              <w:rPr>
+                <w:rFonts w:ascii="Arial" w:hAnsi="Arial" w:eastAsia="Arial"/>
+                <w:b/>
+                <w:i w:val="0"/>
+                <w:sz w:val="17"/>
+                <w:u w:val="none"/>
+              </w:rPr>
+              <w:t>Tahap 2</w:t>
+            </w:r>
+            <w:r>
+              <w:br/>
+            </w:r>
+            <w:r>
+              <w:rPr>
+                <w:rFonts w:ascii="Arial" w:hAnsi="Arial" w:eastAsia="Arial"/>
+                <w:b/>
+                <w:i w:val="0"/>
+                <w:sz w:val="17"/>
+                <w:u w:val="none"/>
+              </w:rPr>
+              <w:t>ATEX Casing v2</w:t>
+            </w:r>
+            <w:r>
+              <w:br/>
+            </w:r>
+            <w:r>
+              <w:rPr>
+                <w:rFonts w:ascii="Arial" w:hAnsi="Arial" w:eastAsia="Arial"/>
+                <w:b/>
+                <w:i w:val="0"/>
+                <w:sz w:val="17"/>
+                <w:u w:val="none"/>
+              </w:rPr>
+              <w:t>(31 Agu 2026)</w:t>
+            </w:r>
+          </w:p>
+        </w:tc>
+        <w:tc>
+          <w:tcPr>
+            <w:tcW w:type="dxa" w:w="1361"/>
+            <w:vAlign w:val="center"/>
+          </w:tcPr>
+          <w:p>
+            <w:pPr>
+              <w:spacing w:after="0"/>
+              <w:jc w:val="left"/>
+            </w:pPr>
+            <w:r>
+              <w:rPr>
+                <w:rFonts w:ascii="Arial" w:hAnsi="Arial" w:eastAsia="Arial"/>
+                <w:b/>
+                <w:i w:val="0"/>
+                <w:sz w:val="17"/>
+                <w:u w:val="none"/>
+              </w:rPr>
+              <w:t>Desain CAD berdimensi</w:t>
+            </w:r>
+          </w:p>
+        </w:tc>
+        <w:tc>
+          <w:tcPr>
+            <w:tcW w:type="dxa" w:w="3402"/>
+            <w:vAlign w:val="center"/>
+          </w:tcPr>
+          <w:p>
+            <w:pPr>
+              <w:spacing w:after="0"/>
+              <w:jc w:val="left"/>
+            </w:pPr>
+            <w:r>
+              <w:rPr>
+                <w:rFonts w:ascii="Arial" w:hAnsi="Arial" w:eastAsia="Arial"/>
+                <w:b w:val="0"/>
+                <w:i w:val="0"/>
+                <w:sz w:val="17"/>
+                <w:u w:val="none"/>
+              </w:rPr>
+              <w:t>Model solid STEP dengan dimensi terkendali (leher Ø75 mm, tinggi 191,51 mm) dan pelat pemasangan U-bolt 250 × 250 mm untuk pipa 2″/DN50, baut M10.</w:t>
+            </w:r>
+          </w:p>
+        </w:tc>
+        <w:tc>
+          <w:tcPr>
+            <w:tcW w:type="dxa" w:w="3458"/>
+            <w:vAlign w:val="center"/>
+          </w:tcPr>
+          <w:p>
+            <w:pPr>
+              <w:spacing w:after="0"/>
+              <w:jc w:val="left"/>
+            </w:pPr>
+            <w:r>
+              <w:rPr>
+                <w:rFonts w:ascii="Arial" w:hAnsi="Arial" w:eastAsia="Arial"/>
+                <w:b w:val="0"/>
+                <w:i w:val="0"/>
+                <w:sz w:val="17"/>
+                <w:u w:val="none"/>
+              </w:rPr>
+              <w:t>Gambar teknik berdimensi menjadi syarat dossier (2.6.a). Metode pemasangan dengan klem U-bolt tanpa las/bor sesuai ketentuan keselamatan kilang.</w:t>
+            </w:r>
+          </w:p>
+        </w:tc>
+      </w:tr>
+      <w:tr>
+        <w:tc>
+          <w:tcPr>
+            <w:tcW w:type="dxa" w:w="1304"/>
+            <w:vAlign w:val="center"/>
+          </w:tcPr>
+          <w:p>
+            <w:pPr>
+              <w:spacing w:after="0"/>
+              <w:jc w:val="center"/>
+            </w:pPr>
+            <w:r>
+              <w:rPr>
+                <w:rFonts w:ascii="Arial" w:hAnsi="Arial" w:eastAsia="Arial"/>
+                <w:b/>
+                <w:i w:val="0"/>
+                <w:sz w:val="17"/>
+                <w:u w:val="none"/>
+              </w:rPr>
+              <w:t>Tahap 3</w:t>
+            </w:r>
+            <w:r>
+              <w:br/>
+            </w:r>
+            <w:r>
+              <w:rPr>
+                <w:rFonts w:ascii="Arial" w:hAnsi="Arial" w:eastAsia="Arial"/>
+                <w:b/>
+                <w:i w:val="0"/>
+                <w:sz w:val="17"/>
+                <w:u w:val="none"/>
+              </w:rPr>
+              <w:t>GLD ATEX Case v3</w:t>
+            </w:r>
+            <w:r>
+              <w:br/>
+            </w:r>
+            <w:r>
+              <w:rPr>
+                <w:rFonts w:ascii="Arial" w:hAnsi="Arial" w:eastAsia="Arial"/>
+                <w:b/>
+                <w:i w:val="0"/>
+                <w:sz w:val="17"/>
+                <w:u w:val="none"/>
+              </w:rPr>
+              <w:t>(8 Sep 2026)</w:t>
+            </w:r>
+          </w:p>
+        </w:tc>
+        <w:tc>
+          <w:tcPr>
+            <w:tcW w:type="dxa" w:w="1361"/>
+            <w:vAlign w:val="center"/>
+          </w:tcPr>
+          <w:p>
+            <w:pPr>
+              <w:spacing w:after="0"/>
+              <w:jc w:val="left"/>
+            </w:pPr>
+            <w:r>
+              <w:rPr>
+                <w:rFonts w:ascii="Arial" w:hAnsi="Arial" w:eastAsia="Arial"/>
+                <w:b/>
+                <w:i w:val="0"/>
+                <w:sz w:val="17"/>
+                <w:u w:val="none"/>
+              </w:rPr>
+              <w:t>Desain cadangan ATEX</w:t>
+            </w:r>
+          </w:p>
+        </w:tc>
+        <w:tc>
+          <w:tcPr>
+            <w:tcW w:type="dxa" w:w="3402"/>
+            <w:vAlign w:val="center"/>
+          </w:tcPr>
+          <w:p>
+            <w:pPr>
+              <w:spacing w:after="0"/>
+              <w:jc w:val="left"/>
+            </w:pPr>
+            <w:r>
+              <w:rPr>
+                <w:rFonts w:ascii="Arial" w:hAnsi="Arial" w:eastAsia="Arial"/>
+                <w:b w:val="0"/>
+                <w:i w:val="0"/>
+                <w:sz w:val="17"/>
+                <w:u w:val="none"/>
+              </w:rPr>
+              <w:t>Kotak sensor dengan kipas DC, cakram mesh stainless steel, tutup dengan kaca transparan, lug pemasangan dinding, dan boss cable entry; set 7 lembar gambar termasuk exploded view.</w:t>
+            </w:r>
+          </w:p>
+        </w:tc>
+        <w:tc>
+          <w:tcPr>
+            <w:tcW w:type="dxa" w:w="3458"/>
+            <w:vAlign w:val="center"/>
+          </w:tcPr>
+          <w:p>
+            <w:pPr>
+              <w:spacing w:after="0"/>
+              <w:jc w:val="left"/>
+            </w:pPr>
+            <w:r>
+              <w:rPr>
+                <w:rFonts w:ascii="Arial" w:hAnsi="Arial" w:eastAsia="Arial"/>
+                <w:b w:val="0"/>
+                <w:i w:val="0"/>
+                <w:sz w:val="17"/>
+                <w:u w:val="none"/>
+              </w:rPr>
+              <w:t>Disiapkan sebagai alternatif bila desain utama tidak lolos uji Ex d; mesh stainless steel pada jalur masuk gas dirancang sebagai penahan api (flame arrestor).</w:t>
+            </w:r>
+          </w:p>
+        </w:tc>
+      </w:tr>
+      <w:tr>
+        <w:tc>
+          <w:tcPr>
+            <w:tcW w:type="dxa" w:w="1304"/>
+            <w:vAlign w:val="center"/>
+          </w:tcPr>
+          <w:p>
+            <w:pPr>
+              <w:spacing w:after="0"/>
+              <w:jc w:val="center"/>
+            </w:pPr>
+            <w:r>
+              <w:rPr>
+                <w:rFonts w:ascii="Arial" w:hAnsi="Arial" w:eastAsia="Arial"/>
+                <w:b/>
+                <w:i w:val="0"/>
+                <w:sz w:val="17"/>
+                <w:u w:val="none"/>
+              </w:rPr>
+              <w:t>Tahap 4</w:t>
+            </w:r>
+            <w:r>
+              <w:br/>
+            </w:r>
+            <w:r>
+              <w:rPr>
+                <w:rFonts w:ascii="Arial" w:hAnsi="Arial" w:eastAsia="Arial"/>
+                <w:b/>
+                <w:i w:val="0"/>
+                <w:sz w:val="17"/>
+                <w:u w:val="none"/>
+              </w:rPr>
+              <w:t>Unit sampel</w:t>
+            </w:r>
+            <w:r>
+              <w:br/>
+            </w:r>
+            <w:r>
+              <w:rPr>
+                <w:rFonts w:ascii="Arial" w:hAnsi="Arial" w:eastAsia="Arial"/>
+                <w:b/>
+                <w:i w:val="0"/>
+                <w:sz w:val="17"/>
+                <w:u w:val="none"/>
+              </w:rPr>
+              <w:t>(Okt 2026)</w:t>
+            </w:r>
+          </w:p>
+        </w:tc>
+        <w:tc>
+          <w:tcPr>
+            <w:tcW w:type="dxa" w:w="1361"/>
+            <w:vAlign w:val="center"/>
+          </w:tcPr>
+          <w:p>
+            <w:pPr>
+              <w:spacing w:after="0"/>
+              <w:jc w:val="left"/>
+            </w:pPr>
+            <w:r>
+              <w:rPr>
+                <w:rFonts w:ascii="Arial" w:hAnsi="Arial" w:eastAsia="Arial"/>
+                <w:b/>
+                <w:i w:val="0"/>
+                <w:sz w:val="17"/>
+                <w:u w:val="none"/>
+              </w:rPr>
+              <w:t>Konfigurasi sertifikasi</w:t>
+            </w:r>
+          </w:p>
+        </w:tc>
+        <w:tc>
+          <w:tcPr>
+            <w:tcW w:type="dxa" w:w="3402"/>
+            <w:vAlign w:val="center"/>
+          </w:tcPr>
+          <w:p>
+            <w:pPr>
+              <w:spacing w:after="0"/>
+              <w:jc w:val="left"/>
+            </w:pPr>
+            <w:r>
+              <w:rPr>
+                <w:rFonts w:ascii="Arial" w:hAnsi="Arial" w:eastAsia="Arial"/>
+                <w:b w:val="0"/>
+                <w:i w:val="0"/>
+                <w:sz w:val="17"/>
+                <w:u w:val="none"/>
+              </w:rPr>
+              <w:t>Base die-cast aluminium ADC12 (dengan mitra casing PT Galaksi Megatama Indonesia); tutup berulir dengan mesh stainless steel di muka depan; O-ring karet pada sambungan tutup; antena dipindah ke muka atas base melalui bulkhead SMA; blanking plug pada entry yang tidak dipakai; sekrup grounding eksternal; entry kabel M20×1,5; posisi nameplate ditetapkan.</w:t>
+            </w:r>
+          </w:p>
+        </w:tc>
+        <w:tc>
+          <w:tcPr>
+            <w:tcW w:type="dxa" w:w="3458"/>
+            <w:vAlign w:val="center"/>
+          </w:tcPr>
+          <w:p>
+            <w:pPr>
+              <w:spacing w:after="0"/>
+              <w:jc w:val="left"/>
+            </w:pPr>
+            <w:r>
+              <w:rPr>
+                <w:rFonts w:ascii="Arial" w:hAnsi="Arial" w:eastAsia="Arial"/>
+                <w:b w:val="0"/>
+                <w:i w:val="0"/>
+                <w:sz w:val="17"/>
+                <w:u w:val="none"/>
+              </w:rPr>
+              <w:t>Satu enclosure logam die-cast untuk konsep Ex d. Panjang ulir leher terukur ±14,8 mm, di atas batas minimum 8 mm IEC 60079-1 untuk volume &gt;100 cm³. O-ring mendukung target IP66; entry tak terpakai ditutup; grounding eksternal tersedia. Unit ini diuji termal 30 Sep 2026 dan diukur dimensinya 7 Okt 2026.</w:t>
+            </w:r>
+          </w:p>
+        </w:tc>
+      </w:tr>
+    </w:tbl>
+    <w:tbl>
+      <w:tblPr>
+        <w:tblW w:type="auto" w:w="0"/>
+        <w:jc w:val="center"/>
+        <w:tblLook w:firstColumn="1" w:firstRow="1" w:lastColumn="0" w:lastRow="0" w:noHBand="0" w:noVBand="1" w:val="04A0"/>
+        <w:tblLayout w:type="fixed"/>
+      </w:tblPr>
+      <w:tblGrid>
+        <w:gridCol w:w="2381"/>
+        <w:gridCol w:w="2381"/>
+        <w:gridCol w:w="2381"/>
+        <w:gridCol w:w="2381"/>
+      </w:tblGrid>
+      <w:tr>
+        <w:tc>
+          <w:tcPr>
+            <w:tcW w:type="dxa" w:w="2381"/>
+          </w:tcPr>
+          <w:p>
+            <w:pPr>
+              <w:jc w:val="center"/>
+            </w:pPr>
+            <w:r>
+              <w:drawing>
+                <wp:inline xmlns:a="http://schemas.openxmlformats.org/drawingml/2006/main" xmlns:pic="http://schemas.openxmlformats.org/drawingml/2006/picture">
+                  <wp:extent cx="870171" cy="1440000"/>
+                  <wp:docPr id="4" name="Picture 4"/>
+                  <wp:cNvGraphicFramePr>
+                    <a:graphicFrameLocks noChangeAspect="1"/>
+                  </wp:cNvGraphicFramePr>
+                  <a:graphic>
+                    <a:graphicData uri="http://schemas.openxmlformats.org/drawingml/2006/picture">
+                      <pic:pic>
+                        <pic:nvPicPr>
+                          <pic:cNvPr id="0" name="image.jpg"/>
+                          <pic:cNvPicPr/>
+                        </pic:nvPicPr>
+                        <pic:blipFill>
+                          <a:blip r:embed="rId13"/>
+                          <a:stretch>
+                            <a:fillRect/>
+                          </a:stretch>
+                        </pic:blipFill>
+                        <pic:spPr>
+                          <a:xfrm>
+                            <a:off x="0" y="0"/>
+                            <a:ext cx="870171" cy="1440000"/>
+                          </a:xfrm>
+                          <a:prstGeom prst="rect"/>
+                        </pic:spPr>
+                      </pic:pic>
+                    </a:graphicData>
+                  </a:graphic>
+                </wp:inline>
+              </w:drawing>
+            </w:r>
+          </w:p>
+        </w:tc>
+        <w:tc>
+          <w:tcPr>
+            <w:tcW w:type="dxa" w:w="2381"/>
+          </w:tcPr>
+          <w:p>
+            <w:pPr>
+              <w:jc w:val="center"/>
+            </w:pPr>
+            <w:r>
+              <w:drawing>
+                <wp:inline xmlns:a="http://schemas.openxmlformats.org/drawingml/2006/main" xmlns:pic="http://schemas.openxmlformats.org/drawingml/2006/picture">
+                  <wp:extent cx="1219651" cy="1440000"/>
+                  <wp:docPr id="5" name="Picture 5"/>
+                  <wp:cNvGraphicFramePr>
+                    <a:graphicFrameLocks noChangeAspect="1"/>
+                  </wp:cNvGraphicFramePr>
+                  <a:graphic>
+                    <a:graphicData uri="http://schemas.openxmlformats.org/drawingml/2006/picture">
+                      <pic:pic>
+                        <pic:nvPicPr>
+                          <pic:cNvPr id="0" name="image.jpg"/>
+                          <pic:cNvPicPr/>
+                        </pic:nvPicPr>
+                        <pic:blipFill>
+                          <a:blip r:embed="rId14"/>
+                          <a:stretch>
+                            <a:fillRect/>
+                          </a:stretch>
+                        </pic:blipFill>
+                        <pic:spPr>
+                          <a:xfrm>
+                            <a:off x="0" y="0"/>
+                            <a:ext cx="1219651" cy="1440000"/>
+                          </a:xfrm>
+                          <a:prstGeom prst="rect"/>
+                        </pic:spPr>
+                      </pic:pic>
+                    </a:graphicData>
+                  </a:graphic>
+                </wp:inline>
+              </w:drawing>
+            </w:r>
+          </w:p>
+        </w:tc>
+        <w:tc>
+          <w:tcPr>
+            <w:tcW w:type="dxa" w:w="2381"/>
+          </w:tcPr>
+          <w:p>
+            <w:pPr>
+              <w:jc w:val="center"/>
+            </w:pPr>
+            <w:r>
+              <w:drawing>
+                <wp:inline xmlns:a="http://schemas.openxmlformats.org/drawingml/2006/main" xmlns:pic="http://schemas.openxmlformats.org/drawingml/2006/picture">
+                  <wp:extent cx="2423077" cy="1440000"/>
+                  <wp:docPr id="6" name="Picture 6"/>
+                  <wp:cNvGraphicFramePr>
+                    <a:graphicFrameLocks noChangeAspect="1"/>
+                  </wp:cNvGraphicFramePr>
+                  <a:graphic>
+                    <a:graphicData uri="http://schemas.openxmlformats.org/drawingml/2006/picture">
+                      <pic:pic>
+                        <pic:nvPicPr>
+                          <pic:cNvPr id="0" name="image.jpg"/>
+                          <pic:cNvPicPr/>
+                        </pic:nvPicPr>
+                        <pic:blipFill>
+                          <a:blip r:embed="rId15"/>
+                          <a:stretch>
+                            <a:fillRect/>
+                          </a:stretch>
+                        </pic:blipFill>
+                        <pic:spPr>
+                          <a:xfrm>
+                            <a:off x="0" y="0"/>
+                            <a:ext cx="2423077" cy="1440000"/>
+                          </a:xfrm>
+                          <a:prstGeom prst="rect"/>
+                        </pic:spPr>
+                      </pic:pic>
+                    </a:graphicData>
+                  </a:graphic>
+                </wp:inline>
+              </w:drawing>
+            </w:r>
+          </w:p>
+        </w:tc>
+        <w:tc>
+          <w:tcPr>
+            <w:tcW w:type="dxa" w:w="2381"/>
+          </w:tcPr>
+          <w:p>
+            <w:pPr>
+              <w:jc w:val="center"/>
+            </w:pPr>
+            <w:r>
+              <w:drawing>
+                <wp:inline xmlns:a="http://schemas.openxmlformats.org/drawingml/2006/main" xmlns:pic="http://schemas.openxmlformats.org/drawingml/2006/picture">
+                  <wp:extent cx="1945946" cy="1440000"/>
+                  <wp:docPr id="7" name="Picture 7"/>
+                  <wp:cNvGraphicFramePr>
+                    <a:graphicFrameLocks noChangeAspect="1"/>
+                  </wp:cNvGraphicFramePr>
+                  <a:graphic>
+                    <a:graphicData uri="http://schemas.openxmlformats.org/drawingml/2006/picture">
+                      <pic:pic>
+                        <pic:nvPicPr>
+                          <pic:cNvPr id="0" name="image.jpg"/>
+                          <pic:cNvPicPr/>
+                        </pic:nvPicPr>
+                        <pic:blipFill>
+                          <a:blip r:embed="rId16"/>
+                          <a:stretch>
+                            <a:fillRect/>
+                          </a:stretch>
+                        </pic:blipFill>
+                        <pic:spPr>
+                          <a:xfrm>
+                            <a:off x="0" y="0"/>
+                            <a:ext cx="1945946" cy="1440000"/>
+                          </a:xfrm>
+                          <a:prstGeom prst="rect"/>
+                        </pic:spPr>
+                      </pic:pic>
+                    </a:graphicData>
+                  </a:graphic>
+                </wp:inline>
+              </w:drawing>
+            </w:r>
+          </w:p>
+        </w:tc>
+      </w:tr>
+      <w:tr>
+        <w:tc>
+          <w:tcPr>
+            <w:tcW w:type="dxa" w:w="2381"/>
+            <w:vAlign w:val="center"/>
+          </w:tcPr>
+          <w:p>
+            <w:pPr>
+              <w:spacing w:after="0"/>
+              <w:jc w:val="center"/>
+            </w:pPr>
+            <w:r>
+              <w:rPr>
+                <w:rFonts w:ascii="Arial" w:hAnsi="Arial" w:eastAsia="Arial"/>
+                <w:b w:val="0"/>
+                <w:i w:val="0"/>
+                <w:sz w:val="16"/>
+                <w:u w:val="none"/>
+              </w:rPr>
+              <w:t>Tahap 1 — prototipe awal</w:t>
+            </w:r>
+          </w:p>
+        </w:tc>
+        <w:tc>
+          <w:tcPr>
+            <w:tcW w:type="dxa" w:w="2381"/>
+            <w:vAlign w:val="center"/>
+          </w:tcPr>
+          <w:p>
+            <w:pPr>
+              <w:spacing w:after="0"/>
+              <w:jc w:val="center"/>
+            </w:pPr>
+            <w:r>
+              <w:rPr>
+                <w:rFonts w:ascii="Arial" w:hAnsi="Arial" w:eastAsia="Arial"/>
+                <w:b w:val="0"/>
+                <w:i w:val="0"/>
+                <w:sz w:val="16"/>
+                <w:u w:val="none"/>
+              </w:rPr>
+              <w:t>Tahap 2 — ATEX Casing v2</w:t>
+            </w:r>
+          </w:p>
+        </w:tc>
+        <w:tc>
+          <w:tcPr>
+            <w:tcW w:type="dxa" w:w="2381"/>
+            <w:vAlign w:val="center"/>
+          </w:tcPr>
+          <w:p>
+            <w:pPr>
+              <w:spacing w:after="0"/>
+              <w:jc w:val="center"/>
+            </w:pPr>
+            <w:r>
+              <w:rPr>
+                <w:rFonts w:ascii="Arial" w:hAnsi="Arial" w:eastAsia="Arial"/>
+                <w:b w:val="0"/>
+                <w:i w:val="0"/>
+                <w:sz w:val="16"/>
+                <w:u w:val="none"/>
+              </w:rPr>
+              <w:t>Tahap 3 — GLD ATEX Case v3</w:t>
+            </w:r>
+          </w:p>
+        </w:tc>
+        <w:tc>
+          <w:tcPr>
+            <w:tcW w:type="dxa" w:w="2381"/>
+            <w:vAlign w:val="center"/>
+          </w:tcPr>
+          <w:p>
+            <w:pPr>
+              <w:spacing w:after="0"/>
+              <w:jc w:val="center"/>
+            </w:pPr>
+            <w:r>
+              <w:rPr>
+                <w:rFonts w:ascii="Arial" w:hAnsi="Arial" w:eastAsia="Arial"/>
+                <w:b w:val="0"/>
+                <w:i w:val="0"/>
+                <w:sz w:val="16"/>
+                <w:u w:val="none"/>
+              </w:rPr>
+              <w:t>Tahap 4 — unit sampel</w:t>
+            </w:r>
+          </w:p>
+        </w:tc>
+      </w:tr>
+    </w:tbl>
+    <w:p>
+      <w:pPr>
+        <w:spacing w:after="120" w:before="80" w:line="276" w:lineRule="auto"/>
+        <w:jc w:val="center"/>
+      </w:pPr>
+      <w:r>
+        <w:rPr>
+          <w:rFonts w:ascii="Arial" w:hAnsi="Arial" w:eastAsia="Arial"/>
+          <w:b w:val="0"/>
+          <w:i/>
+          <w:sz w:val="17"/>
+          <w:u w:val="none"/>
+        </w:rPr>
+        <w:t>Gambar 2. Perkembangan casing GLD dari prototipe awal hingga unit sampel sertifikasi</w:t>
+      </w:r>
+    </w:p>
+    <w:p>
+      <w:pPr>
+        <w:spacing w:after="120" w:before="80" w:line="276" w:lineRule="auto"/>
+        <w:jc w:val="both"/>
+      </w:pPr>
+      <w:r>
+        <w:rPr>
+          <w:rFonts w:ascii="Arial" w:hAnsi="Arial" w:eastAsia="Arial"/>
+          <w:b w:val="0"/>
+          <w:i w:val="0"/>
+          <w:sz w:val="18"/>
+          <w:u w:val="none"/>
+        </w:rPr>
+        <w:t>Catatan. Perbaikan di atas adalah langkah desain menuju sertifikasi, bukan bukti kelulusan. Penilaian kesesuaian tetap dilakukan oleh laboratorium/badan sertifikasi. Butir yang masih ditindaklanjuti: penggantian cable gland prototipe dengan gland Ex d bersertifikat, verifikasi mesh depan sebagai penahan api, uji IP66, kelengkapan titik ukur termal komponen daya, rating fuse PTC pada jalur 24 V, proteksi polaritas terbalik, dan keputusan jalur baterai (terminal BAT).</w:t>
+      </w:r>
+    </w:p>
+    <w:p>
+      <w:pPr>
         <w:keepNext/>
+        <w:pageBreakBefore/>
         <w:spacing w:after="120" w:before="200" w:line="276" w:lineRule="auto"/>
         <w:jc w:val="left"/>
       </w:pPr>
@@ -1859,11 +3247,6 @@
           <w:u w:val="none"/>
         </w:rPr>
         <w:t>Berdasarkan uraian dan lampiran di atas, PT LAPI Ganesha Utama menyatakan bahwa ketentuan Termin 1 pada Surat Pesanan SP-001/KPI43400/2026-S0 (Sertifikasi) — tersedianya prototipe GLD yang telah diuji dan diperbaiki desainnya, disertai foto perangkat dan foto kunjungan ke ITB — telah dipenuhi, dan mengajukan dokumen ini kepada PT Pertamina Patra Niaga untuk diperiksa dan disetujui sebagai dasar proses pembayaran Termin 1.</w:t>
-      </w:r>
-    </w:p>
-    <w:p>
-      <w:r>
-        <w:br w:type="page"/>
       </w:r>
     </w:p>
     <w:p>
@@ -2318,7 +3701,7 @@
               <w:drawing>
                 <wp:inline xmlns:a="http://schemas.openxmlformats.org/drawingml/2006/main" xmlns:pic="http://schemas.openxmlformats.org/drawingml/2006/picture">
                   <wp:extent cx="2149254" cy="1584000"/>
-                  <wp:docPr id="4" name="Picture 4"/>
+                  <wp:docPr id="8" name="Picture 8"/>
                   <wp:cNvGraphicFramePr>
                     <a:graphicFrameLocks noChangeAspect="1"/>
                   </wp:cNvGraphicFramePr>
@@ -2330,7 +3713,7 @@
                           <pic:cNvPicPr/>
                         </pic:nvPicPr>
                         <pic:blipFill>
-                          <a:blip r:embed="rId13"/>
+                          <a:blip r:embed="rId17"/>
                           <a:stretch>
                             <a:fillRect/>
                           </a:stretch>
@@ -2378,7 +3761,7 @@
               <w:drawing>
                 <wp:inline xmlns:a="http://schemas.openxmlformats.org/drawingml/2006/main" xmlns:pic="http://schemas.openxmlformats.org/drawingml/2006/picture">
                   <wp:extent cx="2140541" cy="1584000"/>
-                  <wp:docPr id="5" name="Picture 5"/>
+                  <wp:docPr id="9" name="Picture 9"/>
                   <wp:cNvGraphicFramePr>
                     <a:graphicFrameLocks noChangeAspect="1"/>
                   </wp:cNvGraphicFramePr>
@@ -2390,7 +3773,7 @@
                           <pic:cNvPicPr/>
                         </pic:nvPicPr>
                         <pic:blipFill>
-                          <a:blip r:embed="rId14"/>
+                          <a:blip r:embed="rId16"/>
                           <a:stretch>
                             <a:fillRect/>
                           </a:stretch>
@@ -2440,7 +3823,7 @@
               <w:drawing>
                 <wp:inline xmlns:a="http://schemas.openxmlformats.org/drawingml/2006/main" xmlns:pic="http://schemas.openxmlformats.org/drawingml/2006/picture">
                   <wp:extent cx="2322581" cy="1584000"/>
-                  <wp:docPr id="6" name="Picture 6"/>
+                  <wp:docPr id="10" name="Picture 10"/>
                   <wp:cNvGraphicFramePr>
                     <a:graphicFrameLocks noChangeAspect="1"/>
                   </wp:cNvGraphicFramePr>
@@ -2452,7 +3835,7 @@
                           <pic:cNvPicPr/>
                         </pic:nvPicPr>
                         <pic:blipFill>
-                          <a:blip r:embed="rId15"/>
+                          <a:blip r:embed="rId18"/>
                           <a:stretch>
                             <a:fillRect/>
                           </a:stretch>
@@ -2500,7 +3883,7 @@
               <w:drawing>
                 <wp:inline xmlns:a="http://schemas.openxmlformats.org/drawingml/2006/main" xmlns:pic="http://schemas.openxmlformats.org/drawingml/2006/picture">
                   <wp:extent cx="1679745" cy="1584000"/>
-                  <wp:docPr id="7" name="Picture 7"/>
+                  <wp:docPr id="11" name="Picture 11"/>
                   <wp:cNvGraphicFramePr>
                     <a:graphicFrameLocks noChangeAspect="1"/>
                   </wp:cNvGraphicFramePr>
@@ -2512,7 +3895,7 @@
                           <pic:cNvPicPr/>
                         </pic:nvPicPr>
                         <pic:blipFill>
-                          <a:blip r:embed="rId16"/>
+                          <a:blip r:embed="rId19"/>
                           <a:stretch>
                             <a:fillRect/>
                           </a:stretch>
@@ -2562,7 +3945,7 @@
               <w:drawing>
                 <wp:inline xmlns:a="http://schemas.openxmlformats.org/drawingml/2006/main" xmlns:pic="http://schemas.openxmlformats.org/drawingml/2006/picture">
                   <wp:extent cx="1188000" cy="1584000"/>
-                  <wp:docPr id="8" name="Picture 8"/>
+                  <wp:docPr id="12" name="Picture 12"/>
                   <wp:cNvGraphicFramePr>
                     <a:graphicFrameLocks noChangeAspect="1"/>
                   </wp:cNvGraphicFramePr>
@@ -2574,7 +3957,7 @@
                           <pic:cNvPicPr/>
                         </pic:nvPicPr>
                         <pic:blipFill>
-                          <a:blip r:embed="rId17"/>
+                          <a:blip r:embed="rId20"/>
                           <a:stretch>
                             <a:fillRect/>
                           </a:stretch>
@@ -2622,7 +4005,7 @@
               <w:drawing>
                 <wp:inline xmlns:a="http://schemas.openxmlformats.org/drawingml/2006/main" xmlns:pic="http://schemas.openxmlformats.org/drawingml/2006/picture">
                   <wp:extent cx="1841860" cy="1584000"/>
-                  <wp:docPr id="9" name="Picture 9"/>
+                  <wp:docPr id="13" name="Picture 13"/>
                   <wp:cNvGraphicFramePr>
                     <a:graphicFrameLocks noChangeAspect="1"/>
                   </wp:cNvGraphicFramePr>
@@ -2634,7 +4017,7 @@
                           <pic:cNvPicPr/>
                         </pic:nvPicPr>
                         <pic:blipFill>
-                          <a:blip r:embed="rId18"/>
+                          <a:blip r:embed="rId21"/>
                           <a:stretch>
                             <a:fillRect/>
                           </a:stretch>
@@ -2684,7 +4067,7 @@
               <w:drawing>
                 <wp:inline xmlns:a="http://schemas.openxmlformats.org/drawingml/2006/main" xmlns:pic="http://schemas.openxmlformats.org/drawingml/2006/picture">
                   <wp:extent cx="957189" cy="1584000"/>
-                  <wp:docPr id="10" name="Picture 10"/>
+                  <wp:docPr id="14" name="Picture 14"/>
                   <wp:cNvGraphicFramePr>
                     <a:graphicFrameLocks noChangeAspect="1"/>
                   </wp:cNvGraphicFramePr>
@@ -2696,7 +4079,7 @@
                           <pic:cNvPicPr/>
                         </pic:nvPicPr>
                         <pic:blipFill>
-                          <a:blip r:embed="rId19"/>
+                          <a:blip r:embed="rId13"/>
                           <a:stretch>
                             <a:fillRect/>
                           </a:stretch>
@@ -2744,7 +4127,7 @@
               <w:drawing>
                 <wp:inline xmlns:a="http://schemas.openxmlformats.org/drawingml/2006/main" xmlns:pic="http://schemas.openxmlformats.org/drawingml/2006/picture">
                   <wp:extent cx="1188000" cy="1584000"/>
-                  <wp:docPr id="11" name="Picture 11"/>
+                  <wp:docPr id="15" name="Picture 15"/>
                   <wp:cNvGraphicFramePr>
                     <a:graphicFrameLocks noChangeAspect="1"/>
                   </wp:cNvGraphicFramePr>
@@ -2756,7 +4139,7 @@
                           <pic:cNvPicPr/>
                         </pic:nvPicPr>
                         <pic:blipFill>
-                          <a:blip r:embed="rId20"/>
+                          <a:blip r:embed="rId22"/>
                           <a:stretch>
                             <a:fillRect/>
                           </a:stretch>
@@ -2855,7 +4238,7 @@
               <w:drawing>
                 <wp:inline xmlns:a="http://schemas.openxmlformats.org/drawingml/2006/main" xmlns:pic="http://schemas.openxmlformats.org/drawingml/2006/picture">
                   <wp:extent cx="2112000" cy="1584000"/>
-                  <wp:docPr id="12" name="Picture 12"/>
+                  <wp:docPr id="16" name="Picture 16"/>
                   <wp:cNvGraphicFramePr>
                     <a:graphicFrameLocks noChangeAspect="1"/>
                   </wp:cNvGraphicFramePr>
@@ -2867,7 +4250,7 @@
                           <pic:cNvPicPr/>
                         </pic:nvPicPr>
                         <pic:blipFill>
-                          <a:blip r:embed="rId21"/>
+                          <a:blip r:embed="rId23"/>
                           <a:stretch>
                             <a:fillRect/>
                           </a:stretch>
@@ -2915,7 +4298,7 @@
               <w:drawing>
                 <wp:inline xmlns:a="http://schemas.openxmlformats.org/drawingml/2006/main" xmlns:pic="http://schemas.openxmlformats.org/drawingml/2006/picture">
                   <wp:extent cx="2112000" cy="1584000"/>
-                  <wp:docPr id="13" name="Picture 13"/>
+                  <wp:docPr id="17" name="Picture 17"/>
                   <wp:cNvGraphicFramePr>
                     <a:graphicFrameLocks noChangeAspect="1"/>
                   </wp:cNvGraphicFramePr>
@@ -2927,7 +4310,7 @@
                           <pic:cNvPicPr/>
                         </pic:nvPicPr>
                         <pic:blipFill>
-                          <a:blip r:embed="rId22"/>
+                          <a:blip r:embed="rId24"/>
                           <a:stretch>
                             <a:fillRect/>
                           </a:stretch>
@@ -2977,7 +4360,7 @@
               <w:drawing>
                 <wp:inline xmlns:a="http://schemas.openxmlformats.org/drawingml/2006/main" xmlns:pic="http://schemas.openxmlformats.org/drawingml/2006/picture">
                   <wp:extent cx="2112000" cy="1584000"/>
-                  <wp:docPr id="14" name="Picture 14"/>
+                  <wp:docPr id="18" name="Picture 18"/>
                   <wp:cNvGraphicFramePr>
                     <a:graphicFrameLocks noChangeAspect="1"/>
                   </wp:cNvGraphicFramePr>
@@ -2989,7 +4372,7 @@
                           <pic:cNvPicPr/>
                         </pic:nvPicPr>
                         <pic:blipFill>
-                          <a:blip r:embed="rId23"/>
+                          <a:blip r:embed="rId25"/>
                           <a:stretch>
                             <a:fillRect/>
                           </a:stretch>
@@ -3037,7 +4420,7 @@
               <w:drawing>
                 <wp:inline xmlns:a="http://schemas.openxmlformats.org/drawingml/2006/main" xmlns:pic="http://schemas.openxmlformats.org/drawingml/2006/picture">
                   <wp:extent cx="2520000" cy="1416600"/>
-                  <wp:docPr id="15" name="Picture 15"/>
+                  <wp:docPr id="19" name="Picture 19"/>
                   <wp:cNvGraphicFramePr>
                     <a:graphicFrameLocks noChangeAspect="1"/>
                   </wp:cNvGraphicFramePr>
@@ -3049,7 +4432,7 @@
                           <pic:cNvPicPr/>
                         </pic:nvPicPr>
                         <pic:blipFill>
-                          <a:blip r:embed="rId24"/>
+                          <a:blip r:embed="rId26"/>
                           <a:stretch>
                             <a:fillRect/>
                           </a:stretch>
@@ -3099,7 +4482,7 @@
               <w:drawing>
                 <wp:inline xmlns:a="http://schemas.openxmlformats.org/drawingml/2006/main" xmlns:pic="http://schemas.openxmlformats.org/drawingml/2006/picture">
                   <wp:extent cx="2520000" cy="1418400"/>
-                  <wp:docPr id="16" name="Picture 16"/>
+                  <wp:docPr id="20" name="Picture 20"/>
                   <wp:cNvGraphicFramePr>
                     <a:graphicFrameLocks noChangeAspect="1"/>
                   </wp:cNvGraphicFramePr>
@@ -3111,7 +4494,7 @@
                           <pic:cNvPicPr/>
                         </pic:nvPicPr>
                         <pic:blipFill>
-                          <a:blip r:embed="rId25"/>
+                          <a:blip r:embed="rId27"/>
                           <a:stretch>
                             <a:fillRect/>
                           </a:stretch>
@@ -3159,7 +4542,7 @@
               <w:drawing>
                 <wp:inline xmlns:a="http://schemas.openxmlformats.org/drawingml/2006/main" xmlns:pic="http://schemas.openxmlformats.org/drawingml/2006/picture">
                   <wp:extent cx="2520000" cy="1416600"/>
-                  <wp:docPr id="17" name="Picture 17"/>
+                  <wp:docPr id="21" name="Picture 21"/>
                   <wp:cNvGraphicFramePr>
                     <a:graphicFrameLocks noChangeAspect="1"/>
                   </wp:cNvGraphicFramePr>
@@ -3171,7 +4554,7 @@
                           <pic:cNvPicPr/>
                         </pic:nvPicPr>
                         <pic:blipFill>
-                          <a:blip r:embed="rId26"/>
+                          <a:blip r:embed="rId28"/>
                           <a:stretch>
                             <a:fillRect/>
                           </a:stretch>
@@ -3221,7 +4604,7 @@
               <w:drawing>
                 <wp:inline xmlns:a="http://schemas.openxmlformats.org/drawingml/2006/main" xmlns:pic="http://schemas.openxmlformats.org/drawingml/2006/picture">
                   <wp:extent cx="2520000" cy="1418400"/>
-                  <wp:docPr id="18" name="Picture 18"/>
+                  <wp:docPr id="22" name="Picture 22"/>
                   <wp:cNvGraphicFramePr>
                     <a:graphicFrameLocks noChangeAspect="1"/>
                   </wp:cNvGraphicFramePr>
@@ -3233,7 +4616,7 @@
                           <pic:cNvPicPr/>
                         </pic:nvPicPr>
                         <pic:blipFill>
-                          <a:blip r:embed="rId27"/>
+                          <a:blip r:embed="rId29"/>
                           <a:stretch>
                             <a:fillRect/>
                           </a:stretch>
@@ -3281,7 +4664,7 @@
               <w:drawing>
                 <wp:inline xmlns:a="http://schemas.openxmlformats.org/drawingml/2006/main" xmlns:pic="http://schemas.openxmlformats.org/drawingml/2006/picture">
                   <wp:extent cx="890434" cy="1584000"/>
-                  <wp:docPr id="19" name="Picture 19"/>
+                  <wp:docPr id="23" name="Picture 23"/>
                   <wp:cNvGraphicFramePr>
                     <a:graphicFrameLocks noChangeAspect="1"/>
                   </wp:cNvGraphicFramePr>
@@ -3293,7 +4676,7 @@
                           <pic:cNvPicPr/>
                         </pic:nvPicPr>
                         <pic:blipFill>
-                          <a:blip r:embed="rId28"/>
+                          <a:blip r:embed="rId30"/>
                           <a:stretch>
                             <a:fillRect/>
                           </a:stretch>
@@ -3343,7 +4726,7 @@
               <w:drawing>
                 <wp:inline xmlns:a="http://schemas.openxmlformats.org/drawingml/2006/main" xmlns:pic="http://schemas.openxmlformats.org/drawingml/2006/picture">
                   <wp:extent cx="2112000" cy="1584000"/>
-                  <wp:docPr id="20" name="Picture 20"/>
+                  <wp:docPr id="24" name="Picture 24"/>
                   <wp:cNvGraphicFramePr>
                     <a:graphicFrameLocks noChangeAspect="1"/>
                   </wp:cNvGraphicFramePr>
@@ -3355,7 +4738,7 @@
                           <pic:cNvPicPr/>
                         </pic:nvPicPr>
                         <pic:blipFill>
-                          <a:blip r:embed="rId29"/>
+                          <a:blip r:embed="rId31"/>
                           <a:stretch>
                             <a:fillRect/>
                           </a:stretch>
@@ -3403,7 +4786,7 @@
               <w:drawing>
                 <wp:inline xmlns:a="http://schemas.openxmlformats.org/drawingml/2006/main" xmlns:pic="http://schemas.openxmlformats.org/drawingml/2006/picture">
                   <wp:extent cx="2112000" cy="1584000"/>
-                  <wp:docPr id="21" name="Picture 21"/>
+                  <wp:docPr id="25" name="Picture 25"/>
                   <wp:cNvGraphicFramePr>
                     <a:graphicFrameLocks noChangeAspect="1"/>
                   </wp:cNvGraphicFramePr>
@@ -3415,7 +4798,7 @@
                           <pic:cNvPicPr/>
                         </pic:nvPicPr>
                         <pic:blipFill>
-                          <a:blip r:embed="rId30"/>
+                          <a:blip r:embed="rId32"/>
                           <a:stretch>
                             <a:fillRect/>
                           </a:stretch>

</xml_diff>

<commit_message>
SP-001: hapus kutipan klausul, Pendahuluan dan bahasa formal untuk klien
Co-Authored-By: Claude Opus 5.5 <noreply@anthropic.com>
Claude-Session: https://claude.ai/code/session_01RNmbaVJ5kQVKwCKRCRa4ED
</commit_message>
<xml_diff>
--- a/Paket LGU/03_Pemenuhan_Klausul_Termin_SP-001_Sertifikasi/Dokumen_Pemenuhan_Klausul_Termin_SP-001_Sertifikasi_GLD.docx
+++ b/Paket LGU/03_Pemenuhan_Klausul_Termin_SP-001_Sertifikasi/Dokumen_Pemenuhan_Klausul_Termin_SP-001_Sertifikasi_GLD.docx
@@ -84,10 +84,10 @@
                 <w:rFonts w:ascii="Arial" w:hAnsi="Arial" w:eastAsia="Arial"/>
                 <w:b/>
                 <w:i w:val="0"/>
-                <w:sz w:val="23"/>
+                <w:sz w:val="21"/>
                 <w:u w:val="none"/>
               </w:rPr>
-              <w:t>DOKUMEN PEMENUHAN KLAUSUL TERMIN 1</w:t>
+              <w:t>DOKUMEN PEMENUHAN KETENTUAN TERMIN 1</w:t>
             </w:r>
           </w:p>
         </w:tc>
@@ -521,7 +521,7 @@
           <w:sz w:val="24"/>
           <w:u w:val="none"/>
         </w:rPr>
-        <w:t>1. Klausul Termin yang Dipenuhi</w:t>
+        <w:t>1. Pendahuluan</w:t>
       </w:r>
     </w:p>
     <w:p>
@@ -537,56 +537,12 @@
           <w:sz w:val="20"/>
           <w:u w:val="none"/>
         </w:rPr>
-        <w:t>Ketentuan pembayaran Termin 1 pada Surat Pesanan SP-001/KPI43400/2026-S0 (Sertifikasi) berbunyi:</w:t>
+        <w:t>Dokumen ini disampaikan oleh PT LAPI Ganesha Utama kepada PT Pertamina Patra Niaga sebagai bukti pemenuhan ketentuan pembayaran Termin 1 pada Surat Pesanan SP-001/KPI43400/2026-S0 untuk pekerjaan Sertifikasi Hazardous Area (ATEX/IECEx) Gas Leak Detector (GLD) Tahap 2.</w:t>
       </w:r>
     </w:p>
-    <w:tbl>
-      <w:tblPr>
-        <w:tblW w:type="auto" w:w="0"/>
-        <w:jc w:val="center"/>
-        <w:tblLook w:firstColumn="1" w:firstRow="1" w:lastColumn="0" w:lastRow="0" w:noHBand="0" w:noVBand="1" w:val="04A0"/>
-        <w:tblBorders>
-          <w:top w:val="single" w:sz="6" w:color="000000"/>
-          <w:left w:val="single" w:sz="6" w:color="000000"/>
-          <w:bottom w:val="single" w:sz="6" w:color="000000"/>
-          <w:right w:val="single" w:sz="6" w:color="000000"/>
-          <w:insideH w:val="single" w:sz="6" w:color="000000"/>
-          <w:insideV w:val="single" w:sz="6" w:color="000000"/>
-        </w:tblBorders>
-        <w:tblLayout w:type="fixed"/>
-      </w:tblPr>
-      <w:tblGrid>
-        <w:gridCol w:w="9524"/>
-      </w:tblGrid>
-      <w:tr>
-        <w:tc>
-          <w:tcPr>
-            <w:tcW w:type="dxa" w:w="9524"/>
-            <w:shd w:val="clear" w:color="auto" w:fill="F3F6FC"/>
-            <w:vAlign w:val="center"/>
-          </w:tcPr>
-          <w:p>
-            <w:pPr>
-              <w:spacing w:after="80" w:before="80"/>
-              <w:jc w:val="left"/>
-            </w:pPr>
-            <w:r>
-              <w:rPr>
-                <w:rFonts w:ascii="Arial" w:hAnsi="Arial" w:eastAsia="Arial"/>
-                <w:b/>
-                <w:i w:val="0"/>
-                <w:sz w:val="20"/>
-                <w:u w:val="none"/>
-              </w:rPr>
-              <w:t>“Tersedia prototype GLD yang telah diuji dan diperbaiki desainnya. Dilampirkan foto perangkatnya, dan foto-foto waktu kami kunjungan ke ITB.”</w:t>
-            </w:r>
-          </w:p>
-        </w:tc>
-      </w:tr>
-    </w:tbl>
     <w:p>
       <w:pPr>
-        <w:spacing w:after="120" w:before="120" w:line="276" w:lineRule="auto"/>
+        <w:spacing w:after="120" w:before="0" w:line="276" w:lineRule="auto"/>
         <w:jc w:val="both"/>
       </w:pPr>
       <w:r>
@@ -597,7 +553,23 @@
           <w:sz w:val="20"/>
           <w:u w:val="none"/>
         </w:rPr>
-        <w:t>Dokumen ini menguraikan pemenuhan setiap unsur klausul tersebut beserta buktinya. Penilaian akhir pemenuhan dan persetujuan pembayaran merupakan kewenangan PT Pertamina Patra Niaga.</w:t>
+        <w:t>Ketentuan Termin 1 mencakup ketersediaan prototipe GLD yang telah diuji dan diperbaiki desainnya, disertai dokumentasi foto perangkat serta dokumentasi kunjungan PT Pertamina Patra Niaga ke Institut Teknologi Bandung. Bagian 2 menyajikan matriks pemenuhan setiap ketentuan, Bagian 3 menguraikan pengujian dan perbaikan desain yang telah dilaksanakan, sedangkan dokumentasi foto disajikan pada Lampiran 1 dan Lampiran 2.</w:t>
+      </w:r>
+    </w:p>
+    <w:p>
+      <w:pPr>
+        <w:spacing w:after="120" w:before="0" w:line="276" w:lineRule="auto"/>
+        <w:jc w:val="both"/>
+      </w:pPr>
+      <w:r>
+        <w:rPr>
+          <w:rFonts w:ascii="Arial" w:hAnsi="Arial" w:eastAsia="Arial"/>
+          <w:b w:val="0"/>
+          <w:i w:val="0"/>
+          <w:sz w:val="20"/>
+          <w:u w:val="none"/>
+        </w:rPr>
+        <w:t>Penilaian atas pemenuhan ketentuan dan persetujuan pembayaran merupakan kewenangan PT Pertamina Patra Niaga.</w:t>
       </w:r>
     </w:p>
     <w:p>
@@ -682,7 +654,7 @@
                 <w:sz w:val="18"/>
                 <w:u w:val="none"/>
               </w:rPr>
-              <w:t>Unsur klausul</w:t>
+              <w:t>Ketentuan Termin 1</w:t>
             </w:r>
           </w:p>
         </w:tc>
@@ -797,7 +769,7 @@
                 <w:sz w:val="17"/>
                 <w:u w:val="none"/>
               </w:rPr>
-              <w:t>Tersedia prototype GLD</w:t>
+              <w:t>Prototipe GLD tersedia</w:t>
             </w:r>
           </w:p>
         </w:tc>
@@ -819,7 +791,7 @@
                 <w:sz w:val="17"/>
                 <w:u w:val="none"/>
               </w:rPr>
-              <w:t>Prototipe Node Sensor GLD V2 telah terakit lengkap: casing die-cast aluminium dengan tutup ber-mesh stainless steel, 8 sensor gas (MQ-2/3B/4/5/6/7B/8/135), kipas DC, motherboard ESP32-S3 dengan PCB cover terminal (V4), radio LoRa, catu 24 VDC. Unit yang diajukan untuk sertifikasi ber-S/N GLD2-0x1001; total 4 unit GLD tersedia (3 untuk RU IV + 1 cadangan).</w:t>
+              <w:t>Prototipe Node Sensor GLD V2 telah terakit lengkap: casing die-cast aluminium dengan tutup ber-mesh stainless steel, 8 sensor gas (MQ-2/3B/4/5/6/7B/8/135), kipas DC, motherboard ESP32-S3 dengan PCB cover terminal (V4), radio LoRa, catu 24 VDC. Unit yang diajukan untuk sertifikasi dengan nomor seri GLD2-0x1001; sebanyak 4 unit GLD tersedia (3 untuk RU IV + 1 cadangan).</w:t>
             </w:r>
           </w:p>
         </w:tc>
@@ -909,7 +881,7 @@
                 <w:sz w:val="17"/>
                 <w:u w:val="none"/>
               </w:rPr>
-              <w:t>Telah diuji</w:t>
+              <w:t>Prototipe telah diuji</w:t>
             </w:r>
           </w:p>
         </w:tc>
@@ -1021,7 +993,7 @@
                 <w:sz w:val="17"/>
                 <w:u w:val="none"/>
               </w:rPr>
-              <w:t>Diperbaiki desainnya</w:t>
+              <w:t>Desain telah diperbaiki</w:t>
             </w:r>
           </w:p>
         </w:tc>
@@ -1133,7 +1105,7 @@
                 <w:sz w:val="17"/>
                 <w:u w:val="none"/>
               </w:rPr>
-              <w:t>Dilampirkan foto perangkat</w:t>
+              <w:t>Dokumentasi foto perangkat</w:t>
             </w:r>
           </w:p>
         </w:tc>
@@ -1245,7 +1217,7 @@
                 <w:sz w:val="17"/>
                 <w:u w:val="none"/>
               </w:rPr>
-              <w:t>Dilampirkan foto kunjungan ke ITB</w:t>
+              <w:t>Dokumentasi kunjungan ke ITB</w:t>
             </w:r>
           </w:p>
         </w:tc>
@@ -2926,7 +2898,7 @@
             <w:r>
               <w:drawing>
                 <wp:inline xmlns:a="http://schemas.openxmlformats.org/drawingml/2006/main" xmlns:pic="http://schemas.openxmlformats.org/drawingml/2006/picture">
-                  <wp:extent cx="870171" cy="1440000"/>
+                  <wp:extent cx="652629" cy="1080000"/>
                   <wp:docPr id="4" name="Picture 4"/>
                   <wp:cNvGraphicFramePr>
                     <a:graphicFrameLocks noChangeAspect="1"/>
@@ -2947,7 +2919,7 @@
                         <pic:spPr>
                           <a:xfrm>
                             <a:off x="0" y="0"/>
-                            <a:ext cx="870171" cy="1440000"/>
+                            <a:ext cx="652629" cy="1080000"/>
                           </a:xfrm>
                           <a:prstGeom prst="rect"/>
                         </pic:spPr>
@@ -2970,7 +2942,7 @@
             <w:r>
               <w:drawing>
                 <wp:inline xmlns:a="http://schemas.openxmlformats.org/drawingml/2006/main" xmlns:pic="http://schemas.openxmlformats.org/drawingml/2006/picture">
-                  <wp:extent cx="1219651" cy="1440000"/>
+                  <wp:extent cx="914738" cy="1080000"/>
                   <wp:docPr id="5" name="Picture 5"/>
                   <wp:cNvGraphicFramePr>
                     <a:graphicFrameLocks noChangeAspect="1"/>
@@ -2991,7 +2963,7 @@
                         <pic:spPr>
                           <a:xfrm>
                             <a:off x="0" y="0"/>
-                            <a:ext cx="1219651" cy="1440000"/>
+                            <a:ext cx="914738" cy="1080000"/>
                           </a:xfrm>
                           <a:prstGeom prst="rect"/>
                         </pic:spPr>
@@ -3014,7 +2986,7 @@
             <w:r>
               <w:drawing>
                 <wp:inline xmlns:a="http://schemas.openxmlformats.org/drawingml/2006/main" xmlns:pic="http://schemas.openxmlformats.org/drawingml/2006/picture">
-                  <wp:extent cx="2423077" cy="1440000"/>
+                  <wp:extent cx="1817308" cy="1080000"/>
                   <wp:docPr id="6" name="Picture 6"/>
                   <wp:cNvGraphicFramePr>
                     <a:graphicFrameLocks noChangeAspect="1"/>
@@ -3035,7 +3007,7 @@
                         <pic:spPr>
                           <a:xfrm>
                             <a:off x="0" y="0"/>
-                            <a:ext cx="2423077" cy="1440000"/>
+                            <a:ext cx="1817308" cy="1080000"/>
                           </a:xfrm>
                           <a:prstGeom prst="rect"/>
                         </pic:spPr>
@@ -3058,7 +3030,7 @@
             <w:r>
               <w:drawing>
                 <wp:inline xmlns:a="http://schemas.openxmlformats.org/drawingml/2006/main" xmlns:pic="http://schemas.openxmlformats.org/drawingml/2006/picture">
-                  <wp:extent cx="1945946" cy="1440000"/>
+                  <wp:extent cx="1459459" cy="1080000"/>
                   <wp:docPr id="7" name="Picture 7"/>
                   <wp:cNvGraphicFramePr>
                     <a:graphicFrameLocks noChangeAspect="1"/>
@@ -3079,7 +3051,7 @@
                         <pic:spPr>
                           <a:xfrm>
                             <a:off x="0" y="0"/>
-                            <a:ext cx="1945946" cy="1440000"/>
+                            <a:ext cx="1459459" cy="1080000"/>
                           </a:xfrm>
                           <a:prstGeom prst="rect"/>
                         </pic:spPr>
@@ -3201,7 +3173,7 @@
     </w:p>
     <w:p>
       <w:pPr>
-        <w:spacing w:after="120" w:before="80" w:line="276" w:lineRule="auto"/>
+        <w:spacing w:after="120" w:before="40" w:line="276" w:lineRule="auto"/>
         <w:jc w:val="both"/>
       </w:pPr>
       <w:r>
@@ -3209,10 +3181,10 @@
           <w:rFonts w:ascii="Arial" w:hAnsi="Arial" w:eastAsia="Arial"/>
           <w:b w:val="0"/>
           <w:i w:val="0"/>
-          <w:sz w:val="18"/>
+          <w:sz w:val="17"/>
           <w:u w:val="none"/>
         </w:rPr>
-        <w:t>Catatan. Perbaikan di atas adalah langkah desain menuju sertifikasi, bukan bukti kelulusan. Penilaian kesesuaian tetap dilakukan oleh laboratorium/badan sertifikasi. Butir yang masih ditindaklanjuti: penggantian cable gland prototipe dengan gland Ex d bersertifikat, verifikasi mesh depan sebagai penahan api, uji IP66, kelengkapan titik ukur termal komponen daya, rating fuse PTC pada jalur 24 V, proteksi polaritas terbalik, dan keputusan jalur baterai (terminal BAT).</w:t>
+        <w:t>Catatan: penilaian kesesuaian dilakukan oleh laboratorium dan lembaga sertifikasi. Tindak lanjut berjalan: gland Ex d bersertifikat, verifikasi mesh penahan api, uji IP66, titik ukur termal komponen daya, rating PTC 24 V, proteksi polaritas terbalik, dan keputusan terminal BAT.</w:t>
       </w:r>
     </w:p>
     <w:p>

</xml_diff>